<commit_message>
i redid this thing again(
</commit_message>
<xml_diff>
--- a/lomonosov readings 2026/Клюкин БД.docx
+++ b/lomonosov readings 2026/Клюкин БД.docx
@@ -1,6 +1,6 @@
 
 <file path=word/document.xml><?xml version="1.0" encoding="utf-8"?>
-<w:document xmlns:wpc="http://schemas.microsoft.com/office/word/2010/wordprocessingCanvas" xmlns:cx="http://schemas.microsoft.com/office/drawing/2014/chartex" xmlns:cx1="http://schemas.microsoft.com/office/drawing/2015/9/8/chartex" xmlns:mc="http://schemas.openxmlformats.org/markup-compatibility/2006" xmlns:o="urn:schemas-microsoft-com:office:office" xmlns:r="http://schemas.openxmlformats.org/officeDocument/2006/relationships" xmlns:m="http://schemas.openxmlformats.org/officeDocument/2006/math" xmlns:v="urn:schemas-microsoft-com:vml" xmlns:wp14="http://schemas.microsoft.com/office/word/2010/wordprocessingDrawing" xmlns:wp="http://schemas.openxmlformats.org/drawingml/2006/wordprocessingDrawing" xmlns:w10="urn:schemas-microsoft-com:office:word" xmlns:w="http://schemas.openxmlformats.org/wordprocessingml/2006/main" xmlns:w14="http://schemas.microsoft.com/office/word/2010/wordml" xmlns:w15="http://schemas.microsoft.com/office/word/2012/wordml" xmlns:w16se="http://schemas.microsoft.com/office/word/2015/wordml/symex" xmlns:wpg="http://schemas.microsoft.com/office/word/2010/wordprocessingGroup" xmlns:wpi="http://schemas.microsoft.com/office/word/2010/wordprocessingInk" xmlns:wne="http://schemas.microsoft.com/office/word/2006/wordml" xmlns:wps="http://schemas.microsoft.com/office/word/2010/wordprocessingShape" mc:Ignorable="w14 w15 w16se wp14">
+<w:document xmlns:wpc="http://schemas.microsoft.com/office/word/2010/wordprocessingCanvas" xmlns:mc="http://schemas.openxmlformats.org/markup-compatibility/2006" xmlns:o="urn:schemas-microsoft-com:office:office" xmlns:r="http://schemas.openxmlformats.org/officeDocument/2006/relationships" xmlns:m="http://schemas.openxmlformats.org/officeDocument/2006/math" xmlns:v="urn:schemas-microsoft-com:vml" xmlns:wp14="http://schemas.microsoft.com/office/word/2010/wordprocessingDrawing" xmlns:wp="http://schemas.openxmlformats.org/drawingml/2006/wordprocessingDrawing" xmlns:w10="urn:schemas-microsoft-com:office:word" xmlns:w="http://schemas.openxmlformats.org/wordprocessingml/2006/main" xmlns:w14="http://schemas.microsoft.com/office/word/2010/wordml" xmlns:wpg="http://schemas.microsoft.com/office/word/2010/wordprocessingGroup" xmlns:wpi="http://schemas.microsoft.com/office/word/2010/wordprocessingInk" xmlns:wne="http://schemas.microsoft.com/office/word/2006/wordml" xmlns:wps="http://schemas.microsoft.com/office/word/2010/wordprocessingShape" mc:Ignorable="w14 wp14">
   <w:body>
     <w:p>
       <w:pPr>
@@ -84,16 +84,7 @@
           <w:sz w:val="24"/>
           <w:szCs w:val="28"/>
         </w:rPr>
-        <w:t>спирант</w:t>
-      </w:r>
-      <w:r>
-        <w:rPr>
-          <w:rFonts w:ascii="Times New Roman" w:hAnsi="Times New Roman" w:cs="Times New Roman"/>
-          <w:i/>
-          <w:sz w:val="24"/>
-          <w:szCs w:val="28"/>
-        </w:rPr>
-        <w:t xml:space="preserve"> кафедры </w:t>
+        <w:t xml:space="preserve">спирант кафедры </w:t>
       </w:r>
       <w:r>
         <w:rPr>
@@ -116,6 +107,7 @@
           <w:szCs w:val="28"/>
         </w:rPr>
       </w:pPr>
+      <w:proofErr w:type="spellStart"/>
       <w:r>
         <w:rPr>
           <w:rFonts w:ascii="Times New Roman" w:hAnsi="Times New Roman" w:cs="Times New Roman"/>
@@ -126,6 +118,7 @@
         </w:rPr>
         <w:t>bdklyukin</w:t>
       </w:r>
+      <w:proofErr w:type="spellEnd"/>
       <w:r>
         <w:rPr>
           <w:rFonts w:ascii="Times New Roman" w:hAnsi="Times New Roman" w:cs="Times New Roman"/>
@@ -135,6 +128,7 @@
         </w:rPr>
         <w:t>@</w:t>
       </w:r>
+      <w:proofErr w:type="spellStart"/>
       <w:r>
         <w:rPr>
           <w:rFonts w:ascii="Times New Roman" w:hAnsi="Times New Roman" w:cs="Times New Roman"/>
@@ -145,6 +139,7 @@
         </w:rPr>
         <w:t>gmail</w:t>
       </w:r>
+      <w:proofErr w:type="spellEnd"/>
       <w:r>
         <w:rPr>
           <w:rFonts w:ascii="Times New Roman" w:hAnsi="Times New Roman" w:cs="Times New Roman"/>
@@ -164,17 +159,6 @@
         </w:rPr>
         <w:t>com</w:t>
       </w:r>
-    </w:p>
-    <w:p>
-      <w:pPr>
-        <w:spacing w:line="240" w:lineRule="auto"/>
-        <w:jc w:val="center"/>
-        <w:rPr>
-          <w:rFonts w:ascii="Times New Roman" w:eastAsia="Palatino Linotype" w:hAnsi="Times New Roman" w:cs="Times New Roman"/>
-          <w:sz w:val="24"/>
-          <w:szCs w:val="24"/>
-        </w:rPr>
-      </w:pPr>
     </w:p>
     <w:p>
       <w:pPr>
@@ -267,7 +251,7 @@
           <w:bdr w:val="nil"/>
           <w:lang w:eastAsia="ru-RU"/>
         </w:rPr>
-        <w:t xml:space="preserve">Исследования индийского фондового рынка показывают его положительную связь с экономикой. С. Паламалай и К. Пракасам (данные </w:t>
+        <w:t>Исследования индийского фондового рынка показывают его положительную связь с экономик</w:t>
       </w:r>
       <w:r>
         <w:rPr>
@@ -278,7 +262,7 @@
           <w:bdr w:val="nil"/>
           <w:lang w:eastAsia="ru-RU"/>
         </w:rPr>
-        <w:t xml:space="preserve">за </w:t>
+        <w:t xml:space="preserve">ой. С. Паламалай и К. Пракасам </w:t>
       </w:r>
       <w:r>
         <w:rPr>
@@ -289,40 +273,7 @@
           <w:bdr w:val="nil"/>
           <w:lang w:eastAsia="ru-RU"/>
         </w:rPr>
-        <w:t>1991–2013 гг.) обнаружили положительную двустороннюю связь капитализации с промпроизводством и одностороннее влияние оборота акций на экономику [3]. Н. Хаокип (</w:t>
-      </w:r>
-      <w:r>
-        <w:rPr>
-          <w:rFonts w:ascii="Times New Roman" w:eastAsia="Palatino Linotype" w:hAnsi="Times New Roman" w:cs="Times New Roman"/>
-          <w:sz w:val="24"/>
-          <w:szCs w:val="24"/>
-          <w:u w:color="000000"/>
-          <w:bdr w:val="nil"/>
-          <w:lang w:eastAsia="ru-RU"/>
-        </w:rPr>
-        <w:t xml:space="preserve">данные </w:t>
-      </w:r>
-      <w:r>
-        <w:rPr>
-          <w:rFonts w:ascii="Times New Roman" w:eastAsia="Palatino Linotype" w:hAnsi="Times New Roman" w:cs="Times New Roman"/>
-          <w:sz w:val="24"/>
-          <w:szCs w:val="24"/>
-          <w:u w:color="000000"/>
-          <w:bdr w:val="nil"/>
-          <w:lang w:eastAsia="ru-RU"/>
-        </w:rPr>
-        <w:t xml:space="preserve">за </w:t>
-      </w:r>
-      <w:r>
-        <w:rPr>
-          <w:rFonts w:ascii="Times New Roman" w:eastAsia="Palatino Linotype" w:hAnsi="Times New Roman" w:cs="Times New Roman"/>
-          <w:sz w:val="24"/>
-          <w:szCs w:val="24"/>
-          <w:u w:color="000000"/>
-          <w:bdr w:val="nil"/>
-          <w:lang w:eastAsia="ru-RU"/>
-        </w:rPr>
-        <w:t>1993–2017 гг.) подтвердил двунаправленную связь капитализации, а также влияние других показателей фондового рынка на промпроизводство [1]. Оба автора сходятся во мнении, что для ускорения роста Индии необходимо развивать фондовый рынок.</w:t>
+        <w:t>обнаружили положительную двустороннюю связь капитализации с промпроизводством и одностороннее влияние оборота акций на экономику [3]. Н. Хаокип подтвердил двунаправленную связь капитализации, а также влияние других показателей фондового рынка на промпроизводство [1]. Оба автора сходятся во мнении, что для ускорения роста Индии необходимо развивать фондовый рынок.</w:t>
       </w:r>
     </w:p>
     <w:p>
@@ -356,7 +307,7 @@
           <w:bdr w:val="nil"/>
           <w:lang w:eastAsia="ru-RU"/>
         </w:rPr>
-        <w:t>В Китае выводы неоднозначны. С. Кай и Ц. Ляо (</w:t>
+        <w:t>В Китае выводы неоднозначны. С. Кай и Ц. Ляо выявили положительную связь капитализации с ВВП, но слабую зависимость от ликвидности и волатильности [2]. Л. Пан и В. Мишра обнаружили незначительное отрицательное влияние капитализации на экономику, но при этом подтвердили положительное влияние самого экономического роста на капитализацию [4]. Несмотря на противоречивость статданных, авторы также рекомендуют Китаю развивать фондовый рынок.</w:t>
       </w:r>
       <w:r>
         <w:rPr>
@@ -367,8 +318,20 @@
           <w:bdr w:val="nil"/>
           <w:lang w:eastAsia="ru-RU"/>
         </w:rPr>
-        <w:t xml:space="preserve">данные </w:t>
-      </w:r>
+        <w:t xml:space="preserve"> </w:t>
+      </w:r>
+    </w:p>
+    <w:p>
+      <w:pPr>
+        <w:spacing w:after="0" w:line="360" w:lineRule="auto"/>
+        <w:ind w:firstLine="708"/>
+        <w:jc w:val="both"/>
+        <w:rPr>
+          <w:rFonts w:ascii="Times New Roman" w:hAnsi="Times New Roman" w:cs="Times New Roman"/>
+          <w:sz w:val="24"/>
+          <w:szCs w:val="24"/>
+        </w:rPr>
+      </w:pPr>
       <w:r>
         <w:rPr>
           <w:rFonts w:ascii="Times New Roman" w:eastAsia="Palatino Linotype" w:hAnsi="Times New Roman" w:cs="Times New Roman"/>
@@ -378,7 +341,7 @@
           <w:bdr w:val="nil"/>
           <w:lang w:eastAsia="ru-RU"/>
         </w:rPr>
-        <w:t xml:space="preserve">за </w:t>
+        <w:t xml:space="preserve">Используя данные о валовом внутреннем продукте Республики Индия и Китайской Народной Республики за период с 2002 по 2024 год (зависимая переменная), их рыночной капитализации за тот же период (основная независимая переменная), а также </w:t>
       </w:r>
       <w:r>
         <w:rPr>
@@ -389,7 +352,7 @@
           <w:bdr w:val="nil"/>
           <w:lang w:eastAsia="ru-RU"/>
         </w:rPr>
-        <w:t>2007–2018 гг.) выявили положительную связь капитализации с ВВП, но слабую зависимость от ликвидности и волатильности [2]. Л. Пан и В. Мишра (</w:t>
+        <w:t xml:space="preserve">задолжностью </w:t>
       </w:r>
       <w:r>
         <w:rPr>
@@ -400,7 +363,7 @@
           <w:bdr w:val="nil"/>
           <w:lang w:eastAsia="ru-RU"/>
         </w:rPr>
-        <w:t xml:space="preserve">данные </w:t>
+        <w:t>и экспорте товаров и услуг (</w:t>
       </w:r>
       <w:r>
         <w:rPr>
@@ -411,7 +374,7 @@
           <w:bdr w:val="nil"/>
           <w:lang w:eastAsia="ru-RU"/>
         </w:rPr>
-        <w:t xml:space="preserve">за </w:t>
+        <w:t>контрольные переменные</w:t>
       </w:r>
       <w:r>
         <w:rPr>
@@ -422,7 +385,94 @@
           <w:bdr w:val="nil"/>
           <w:lang w:eastAsia="ru-RU"/>
         </w:rPr>
-        <w:t>1999–2015 гг.) обнаружили незначительное отрицательное влияние капитализации на экономику, но при этом подтвердили положительное влияние самого экономического роста на капитализацию [4]. Несмотря на противоречивость статданных, авторы также рекомендуют Китаю развивать фондовый рынок.</w:t>
+        <w:t xml:space="preserve"> для предотвращения </w:t>
+      </w:r>
+      <w:r>
+        <w:rPr>
+          <w:rFonts w:ascii="Times New Roman" w:eastAsia="Palatino Linotype" w:hAnsi="Times New Roman" w:cs="Times New Roman"/>
+          <w:sz w:val="24"/>
+          <w:szCs w:val="24"/>
+          <w:u w:color="000000"/>
+          <w:bdr w:val="nil"/>
+          <w:lang w:eastAsia="ru-RU"/>
+        </w:rPr>
+        <w:t>систематической ошибки, вызванной упущенными переменными</w:t>
+      </w:r>
+      <w:r>
+        <w:rPr>
+          <w:rFonts w:ascii="Times New Roman" w:eastAsia="Palatino Linotype" w:hAnsi="Times New Roman" w:cs="Times New Roman"/>
+          <w:sz w:val="24"/>
+          <w:szCs w:val="24"/>
+          <w:u w:color="000000"/>
+          <w:bdr w:val="nil"/>
+          <w:lang w:eastAsia="ru-RU"/>
+        </w:rPr>
+        <w:t>), автор оценил вклад рыночной капитализации в квартальный ВВП этих стран.</w:t>
+      </w:r>
+      <w:r>
+        <w:rPr>
+          <w:rFonts w:ascii="Times New Roman" w:eastAsia="Palatino Linotype" w:hAnsi="Times New Roman" w:cs="Times New Roman"/>
+          <w:sz w:val="24"/>
+          <w:szCs w:val="24"/>
+          <w:u w:color="000000"/>
+          <w:bdr w:val="nil"/>
+          <w:lang w:eastAsia="ru-RU"/>
+        </w:rPr>
+        <w:t xml:space="preserve"> </w:t>
+      </w:r>
+      <w:r>
+        <w:rPr>
+          <w:rFonts w:ascii="Times New Roman" w:hAnsi="Times New Roman" w:cs="Times New Roman"/>
+          <w:sz w:val="24"/>
+          <w:szCs w:val="24"/>
+        </w:rPr>
+        <w:t>Для дост</w:t>
+      </w:r>
+      <w:r>
+        <w:rPr>
+          <w:rFonts w:ascii="Times New Roman" w:hAnsi="Times New Roman" w:cs="Times New Roman"/>
+          <w:sz w:val="24"/>
+          <w:szCs w:val="24"/>
+        </w:rPr>
+        <w:t>ижения этой цели использовала</w:t>
+      </w:r>
+      <w:r>
+        <w:rPr>
+          <w:rFonts w:ascii="Times New Roman" w:hAnsi="Times New Roman" w:cs="Times New Roman"/>
+          <w:sz w:val="24"/>
+          <w:szCs w:val="24"/>
+        </w:rPr>
+        <w:t>сь сезонная декомпозиция, тесты на стационарность, тест на коинтеграцию</w:t>
+      </w:r>
+      <w:r>
+        <w:rPr>
+          <w:rFonts w:ascii="Times New Roman" w:hAnsi="Times New Roman" w:cs="Times New Roman"/>
+          <w:sz w:val="24"/>
+          <w:szCs w:val="24"/>
+          <w:u w:color="000000"/>
+          <w:bdr w:val="nil"/>
+        </w:rPr>
+        <w:t xml:space="preserve">, рассчитана модель векторной авторегрессии, кумулятивный отклик на импульс и провиден анализ </w:t>
+      </w:r>
+      <w:r>
+        <w:rPr>
+          <w:rFonts w:ascii="Times New Roman" w:hAnsi="Times New Roman" w:cs="Times New Roman"/>
+          <w:sz w:val="24"/>
+          <w:szCs w:val="24"/>
+          <w:u w:color="000000"/>
+          <w:bdr w:val="nil"/>
+        </w:rPr>
+        <w:t>дисперсии ошибки прогноза</w:t>
+      </w:r>
+      <w:r>
+        <w:rPr>
+          <w:rFonts w:ascii="Times New Roman" w:hAnsi="Times New Roman" w:cs="Times New Roman"/>
+          <w:sz w:val="24"/>
+          <w:szCs w:val="24"/>
+          <w:u w:color="000000"/>
+          <w:bdr w:val="nil"/>
+        </w:rPr>
+        <w:t>.</w:t>
       </w:r>
     </w:p>
     <w:p>
@@ -438,123 +488,126 @@
       </w:pPr>
       <w:r>
         <w:rPr>
-          <w:rFonts w:ascii="Times New Roman" w:eastAsia="Palatino Linotype" w:hAnsi="Times New Roman" w:cs="Times New Roman"/>
+          <w:rFonts w:ascii="Times New Roman" w:hAnsi="Times New Roman" w:cs="Times New Roman"/>
+          <w:sz w:val="24"/>
+          <w:szCs w:val="24"/>
+        </w:rPr>
+        <w:lastRenderedPageBreak/>
+        <w:t xml:space="preserve">Все данные оказались </w:t>
+      </w:r>
+      <w:r>
+        <w:rPr>
+          <w:rFonts w:ascii="Times New Roman" w:hAnsi="Times New Roman" w:cs="Times New Roman"/>
+          <w:sz w:val="24"/>
+          <w:szCs w:val="24"/>
+        </w:rPr>
+        <w:t xml:space="preserve">в разной степени </w:t>
+      </w:r>
+      <w:r>
+        <w:rPr>
+          <w:rFonts w:ascii="Times New Roman" w:hAnsi="Times New Roman" w:cs="Times New Roman"/>
+          <w:sz w:val="24"/>
+          <w:szCs w:val="24"/>
+        </w:rPr>
+        <w:t xml:space="preserve">сезонными, что было учтено. </w:t>
+      </w:r>
+      <w:r>
+        <w:rPr>
+          <w:rFonts w:ascii="Times New Roman" w:hAnsi="Times New Roman" w:cs="Times New Roman"/>
+          <w:sz w:val="24"/>
+          <w:szCs w:val="24"/>
+        </w:rPr>
+        <w:t>В исход</w:t>
+      </w:r>
+      <w:r>
+        <w:rPr>
+          <w:rFonts w:ascii="Times New Roman" w:hAnsi="Times New Roman" w:cs="Times New Roman"/>
+          <w:sz w:val="24"/>
+          <w:szCs w:val="24"/>
+        </w:rPr>
+        <w:t xml:space="preserve">ном виде данные не стационарны, что позволяет провети коинграционный анализ. </w:t>
+      </w:r>
+      <w:r>
+        <w:rPr>
+          <w:rFonts w:ascii="Times New Roman" w:hAnsi="Times New Roman" w:cs="Times New Roman"/>
+          <w:sz w:val="24"/>
+          <w:szCs w:val="24"/>
+        </w:rPr>
+        <w:t>Тесты показали о наличии</w:t>
+      </w:r>
+      <w:r>
+        <w:rPr>
+          <w:rFonts w:ascii="Times New Roman" w:hAnsi="Times New Roman" w:cs="Times New Roman"/>
+          <w:sz w:val="24"/>
+          <w:szCs w:val="24"/>
+        </w:rPr>
+        <w:t xml:space="preserve"> </w:t>
+      </w:r>
+      <w:r>
+        <w:rPr>
+          <w:rFonts w:ascii="Times New Roman" w:hAnsi="Times New Roman" w:cs="Times New Roman"/>
+          <w:sz w:val="24"/>
+          <w:szCs w:val="24"/>
+        </w:rPr>
+        <w:t xml:space="preserve">долгосрочного тренда совместного </w:t>
+      </w:r>
+      <w:r>
+        <w:rPr>
+          <w:rFonts w:ascii="Times New Roman" w:hAnsi="Times New Roman" w:cs="Times New Roman"/>
+          <w:sz w:val="24"/>
+          <w:szCs w:val="24"/>
+        </w:rPr>
+        <w:t>роста экономики с капитализацией в</w:t>
+      </w:r>
+      <w:r>
+        <w:rPr>
+          <w:rFonts w:ascii="Times New Roman" w:hAnsi="Times New Roman" w:cs="Times New Roman"/>
+          <w:sz w:val="24"/>
+          <w:szCs w:val="24"/>
+        </w:rPr>
+        <w:t xml:space="preserve"> Индии</w:t>
+      </w:r>
+      <w:r>
+        <w:rPr>
+          <w:rFonts w:ascii="Times New Roman" w:hAnsi="Times New Roman" w:cs="Times New Roman"/>
+          <w:sz w:val="24"/>
+          <w:szCs w:val="24"/>
+        </w:rPr>
+        <w:t>, и с задолжностью в Китае. Отсутсвие долгосрочных связей</w:t>
+      </w:r>
+      <w:r>
+        <w:rPr>
+          <w:rFonts w:ascii="Times New Roman" w:hAnsi="Times New Roman" w:cs="Times New Roman"/>
+          <w:sz w:val="24"/>
+          <w:szCs w:val="24"/>
+        </w:rPr>
+        <w:t xml:space="preserve">, не исключает краткосрочных взаимодействий. Их позволила оценить векторная </w:t>
+      </w:r>
+      <w:r>
+        <w:rPr>
+          <w:rFonts w:ascii="Times New Roman" w:hAnsi="Times New Roman" w:cs="Times New Roman"/>
           <w:sz w:val="24"/>
           <w:szCs w:val="24"/>
           <w:u w:color="000000"/>
           <w:bdr w:val="nil"/>
-          <w:lang w:eastAsia="ru-RU"/>
-        </w:rPr>
-        <w:t xml:space="preserve">Используя данные национальных статистических ведомств КНР и РИ, квартальные дефлятор ОЭСР и биржевые данные </w:t>
-      </w:r>
-      <w:r>
-        <w:rPr>
-          <w:rFonts w:ascii="Times New Roman" w:eastAsia="Palatino Linotype" w:hAnsi="Times New Roman" w:cs="Times New Roman"/>
+        </w:rPr>
+        <w:t>авторегрессия</w:t>
+      </w:r>
+      <w:r>
+        <w:rPr>
+          <w:rFonts w:ascii="Times New Roman" w:hAnsi="Times New Roman" w:cs="Times New Roman"/>
           <w:sz w:val="24"/>
           <w:szCs w:val="24"/>
           <w:u w:color="000000"/>
           <w:bdr w:val="nil"/>
-          <w:lang w:eastAsia="ru-RU"/>
-        </w:rPr>
-        <w:t>Всемирной федерации бирж</w:t>
-      </w:r>
-      <w:r>
-        <w:rPr>
-          <w:rFonts w:ascii="Times New Roman" w:eastAsia="Palatino Linotype" w:hAnsi="Times New Roman" w:cs="Times New Roman"/>
-          <w:sz w:val="24"/>
-          <w:szCs w:val="24"/>
-          <w:u w:color="000000"/>
-          <w:bdr w:val="nil"/>
-          <w:lang w:eastAsia="ru-RU"/>
-        </w:rPr>
-        <w:t xml:space="preserve"> автор </w:t>
-      </w:r>
-      <w:r>
-        <w:rPr>
-          <w:rFonts w:ascii="Times New Roman" w:eastAsia="Palatino Linotype" w:hAnsi="Times New Roman" w:cs="Times New Roman"/>
-          <w:sz w:val="24"/>
-          <w:szCs w:val="24"/>
-        </w:rPr>
-        <w:t>исследов</w:t>
-      </w:r>
-      <w:r>
-        <w:rPr>
-          <w:rFonts w:ascii="Times New Roman" w:eastAsia="Palatino Linotype" w:hAnsi="Times New Roman" w:cs="Times New Roman"/>
-          <w:sz w:val="24"/>
-          <w:szCs w:val="24"/>
-        </w:rPr>
-        <w:t xml:space="preserve">ал </w:t>
-      </w:r>
-      <w:r>
-        <w:rPr>
-          <w:rFonts w:ascii="Times New Roman" w:eastAsia="Palatino Linotype" w:hAnsi="Times New Roman" w:cs="Times New Roman"/>
-          <w:sz w:val="24"/>
-          <w:szCs w:val="24"/>
-        </w:rPr>
-        <w:t xml:space="preserve">вклад капитализации фондового рынка, объема торгов на биржах, оборачиваемости акций, волатильности доходности и соотношения «цена/прибыль» в квартальный валовый внутренний продукт </w:t>
-      </w:r>
-      <w:r>
-        <w:rPr>
-          <w:rFonts w:ascii="Times New Roman" w:eastAsia="Palatino Linotype" w:hAnsi="Times New Roman" w:cs="Times New Roman"/>
-          <w:sz w:val="24"/>
-          <w:szCs w:val="24"/>
-          <w:u w:color="000000"/>
-          <w:bdr w:val="nil"/>
-          <w:lang w:eastAsia="ru-RU"/>
-        </w:rPr>
-        <w:t>Республики Индия и Китайской Народной Республики</w:t>
-      </w:r>
-      <w:r>
-        <w:rPr>
-          <w:rFonts w:ascii="Times New Roman" w:eastAsia="Palatino Linotype" w:hAnsi="Times New Roman" w:cs="Times New Roman"/>
-          <w:sz w:val="24"/>
-          <w:szCs w:val="24"/>
-        </w:rPr>
-        <w:t xml:space="preserve"> с 2002 по 2024 гг.</w:t>
-      </w:r>
-      <w:r>
-        <w:rPr>
-          <w:rFonts w:ascii="Times New Roman" w:hAnsi="Times New Roman" w:cs="Times New Roman"/>
-          <w:sz w:val="24"/>
-          <w:szCs w:val="24"/>
-        </w:rPr>
-        <w:t xml:space="preserve"> </w:t>
-      </w:r>
-      <w:r>
-        <w:rPr>
-          <w:rFonts w:ascii="Times New Roman" w:hAnsi="Times New Roman" w:cs="Times New Roman"/>
-          <w:sz w:val="24"/>
-          <w:szCs w:val="24"/>
-        </w:rPr>
-        <w:t>Для достижения этой цели использовались сезонная декомпозиция, тесты на стационарность, тест на коинтеграцию</w:t>
-      </w:r>
-      <w:r>
-        <w:rPr>
-          <w:rFonts w:ascii="Times New Roman" w:hAnsi="Times New Roman" w:cs="Times New Roman"/>
-          <w:sz w:val="24"/>
-          <w:szCs w:val="24"/>
-          <w:u w:color="000000"/>
-          <w:bdr w:val="nil"/>
-        </w:rPr>
-        <w:t xml:space="preserve">, рассчитана модель векторной авторегрессии, отклик на импульс, кумулятивный отклик на импульс и провиден анализ </w:t>
-      </w:r>
-      <w:r>
-        <w:rPr>
-          <w:rFonts w:ascii="Times New Roman" w:hAnsi="Times New Roman" w:cs="Times New Roman"/>
-          <w:sz w:val="24"/>
-          <w:szCs w:val="24"/>
-          <w:u w:color="000000"/>
-          <w:bdr w:val="nil"/>
-        </w:rPr>
-        <w:t>дисперсии ошибки прогноза</w:t>
-      </w:r>
-      <w:r>
-        <w:rPr>
-          <w:rFonts w:ascii="Times New Roman" w:hAnsi="Times New Roman" w:cs="Times New Roman"/>
-          <w:sz w:val="24"/>
-          <w:szCs w:val="24"/>
-          <w:u w:color="000000"/>
-          <w:bdr w:val="nil"/>
+        </w:rPr>
+        <w:t>, предварительно взяв их первую разницу</w:t>
+      </w:r>
+      <w:r>
+        <w:rPr>
+          <w:rFonts w:ascii="Times New Roman" w:hAnsi="Times New Roman" w:cs="Times New Roman"/>
+          <w:sz w:val="24"/>
+          <w:szCs w:val="24"/>
         </w:rPr>
         <w:t>.</w:t>
       </w:r>
@@ -576,26 +629,119 @@
           <w:sz w:val="24"/>
           <w:szCs w:val="24"/>
         </w:rPr>
-        <w:lastRenderedPageBreak/>
-        <w:t xml:space="preserve">Сезонность была обнаружена и устранена у ВВП обеих стран. В исходном виде данные не стационарны, но их первая разница делает их таковыми. В исходном виде данные не коинтегрированы, т.е. не имеют долгосрочного тренда совместного развития, что, однако, не исключает краткосрочных взаимодействий. Их позволила оценить векторная </w:t>
-      </w:r>
-      <w:r>
-        <w:rPr>
-          <w:rFonts w:ascii="Times New Roman" w:hAnsi="Times New Roman" w:cs="Times New Roman"/>
-          <w:sz w:val="24"/>
-          <w:szCs w:val="24"/>
-          <w:u w:color="000000"/>
-          <w:bdr w:val="nil"/>
-        </w:rPr>
-        <w:t>авторегрессия</w:t>
-      </w:r>
-      <w:r>
-        <w:rPr>
-          <w:rFonts w:ascii="Times New Roman" w:hAnsi="Times New Roman" w:cs="Times New Roman"/>
-          <w:sz w:val="24"/>
-          <w:szCs w:val="24"/>
-        </w:rPr>
-        <w:t>.</w:t>
+        <w:t>Анализ кумулятивного</w:t>
+      </w:r>
+      <w:r>
+        <w:rPr>
+          <w:rFonts w:ascii="Times New Roman" w:hAnsi="Times New Roman" w:cs="Times New Roman"/>
+          <w:sz w:val="24"/>
+          <w:szCs w:val="24"/>
+        </w:rPr>
+        <w:t xml:space="preserve"> отклик</w:t>
+      </w:r>
+      <w:r>
+        <w:rPr>
+          <w:rFonts w:ascii="Times New Roman" w:hAnsi="Times New Roman" w:cs="Times New Roman"/>
+          <w:sz w:val="24"/>
+          <w:szCs w:val="24"/>
+        </w:rPr>
+        <w:t>а</w:t>
+      </w:r>
+      <w:r>
+        <w:rPr>
+          <w:rFonts w:ascii="Times New Roman" w:hAnsi="Times New Roman" w:cs="Times New Roman"/>
+          <w:sz w:val="24"/>
+          <w:szCs w:val="24"/>
+        </w:rPr>
+        <w:t xml:space="preserve"> </w:t>
+      </w:r>
+      <w:r>
+        <w:rPr>
+          <w:rFonts w:ascii="Times New Roman" w:hAnsi="Times New Roman" w:cs="Times New Roman"/>
+          <w:sz w:val="24"/>
+          <w:szCs w:val="24"/>
+        </w:rPr>
+        <w:t xml:space="preserve">ВВП </w:t>
+      </w:r>
+      <w:r>
+        <w:rPr>
+          <w:rFonts w:ascii="Times New Roman" w:hAnsi="Times New Roman" w:cs="Times New Roman"/>
+          <w:sz w:val="24"/>
+          <w:szCs w:val="24"/>
+        </w:rPr>
+        <w:t>на импульс</w:t>
+      </w:r>
+      <w:r>
+        <w:rPr>
+          <w:rFonts w:ascii="Times New Roman" w:hAnsi="Times New Roman" w:cs="Times New Roman"/>
+          <w:sz w:val="24"/>
+          <w:szCs w:val="24"/>
+        </w:rPr>
+        <w:t xml:space="preserve"> прочих переменных позволяет охарактерезовать знак их эффекта на экономику. </w:t>
+      </w:r>
+      <w:r>
+        <w:rPr>
+          <w:rFonts w:ascii="Times New Roman" w:hAnsi="Times New Roman" w:cs="Times New Roman"/>
+          <w:sz w:val="24"/>
+          <w:szCs w:val="24"/>
+        </w:rPr>
+        <w:t>В Индии рыночная капитализация</w:t>
+      </w:r>
+      <w:r>
+        <w:rPr>
+          <w:rFonts w:ascii="Times New Roman" w:hAnsi="Times New Roman" w:cs="Times New Roman"/>
+          <w:sz w:val="24"/>
+          <w:szCs w:val="24"/>
+        </w:rPr>
+        <w:t>, задолжность и экспорт</w:t>
+      </w:r>
+      <w:r>
+        <w:rPr>
+          <w:rFonts w:ascii="Times New Roman" w:hAnsi="Times New Roman" w:cs="Times New Roman"/>
+          <w:sz w:val="24"/>
+          <w:szCs w:val="24"/>
+        </w:rPr>
+        <w:t xml:space="preserve"> товаров и услуг</w:t>
+      </w:r>
+      <w:r>
+        <w:rPr>
+          <w:rFonts w:ascii="Times New Roman" w:hAnsi="Times New Roman" w:cs="Times New Roman"/>
+          <w:sz w:val="24"/>
+          <w:szCs w:val="24"/>
+        </w:rPr>
+        <w:t xml:space="preserve"> оказываю</w:t>
+      </w:r>
+      <w:r>
+        <w:rPr>
+          <w:rFonts w:ascii="Times New Roman" w:hAnsi="Times New Roman" w:cs="Times New Roman"/>
+          <w:sz w:val="24"/>
+          <w:szCs w:val="24"/>
+        </w:rPr>
+        <w:t xml:space="preserve">т положительное влияние на ВВП. В Китае ситуация </w:t>
+      </w:r>
+      <w:r>
+        <w:rPr>
+          <w:rFonts w:ascii="Times New Roman" w:hAnsi="Times New Roman" w:cs="Times New Roman"/>
+          <w:sz w:val="24"/>
+          <w:szCs w:val="24"/>
+        </w:rPr>
+        <w:t>аналогичная за исключением рыночной капитализации, она</w:t>
+      </w:r>
+      <w:r>
+        <w:rPr>
+          <w:rFonts w:ascii="Times New Roman" w:hAnsi="Times New Roman" w:cs="Times New Roman"/>
+          <w:sz w:val="24"/>
+          <w:szCs w:val="24"/>
+        </w:rPr>
+        <w:t xml:space="preserve"> оказывает отрицательное влияние.</w:t>
+      </w:r>
+      <w:r>
+        <w:rPr>
+          <w:rFonts w:ascii="Times New Roman" w:hAnsi="Times New Roman" w:cs="Times New Roman"/>
+          <w:sz w:val="24"/>
+          <w:szCs w:val="24"/>
+        </w:rPr>
+        <w:t xml:space="preserve"> </w:t>
       </w:r>
     </w:p>
     <w:p>
@@ -607,15 +753,136 @@
           <w:rFonts w:ascii="Times New Roman" w:hAnsi="Times New Roman" w:cs="Times New Roman"/>
           <w:sz w:val="24"/>
           <w:szCs w:val="24"/>
-        </w:rPr>
-      </w:pPr>
-      <w:r>
-        <w:rPr>
-          <w:rFonts w:ascii="Times New Roman" w:hAnsi="Times New Roman" w:cs="Times New Roman"/>
-          <w:sz w:val="24"/>
-          <w:szCs w:val="24"/>
-        </w:rPr>
-        <w:t>В Индии рыночная капитализация оказывает положительное влияние на ВВП, в то время как объем торгов и коэффициент цена/прибыль оказывают отрицательное влияние. В Китае ситуация иная: рыночная капитализация оказывает отрицательное влияние, в то время как объем торгов и коэффициент цена/прибыль оказывают положительное влияние. Оборот имеет существенное значение только для Китая (отрицательное влияние), в то время как волатильность не оказывает влияния на экономику ни одной из стран.</w:t>
+          <w:lang w:val="en-US"/>
+        </w:rPr>
+      </w:pPr>
+      <w:r>
+        <w:rPr>
+          <w:rFonts w:ascii="Times New Roman" w:hAnsi="Times New Roman" w:cs="Times New Roman"/>
+          <w:sz w:val="24"/>
+          <w:szCs w:val="24"/>
+        </w:rPr>
+        <w:t xml:space="preserve">Разложение дисперсии показало, что, </w:t>
+      </w:r>
+      <w:r>
+        <w:rPr>
+          <w:rFonts w:ascii="Times New Roman" w:hAnsi="Times New Roman" w:cs="Times New Roman"/>
+          <w:sz w:val="24"/>
+          <w:szCs w:val="24"/>
+        </w:rPr>
+        <w:t xml:space="preserve">рассмотренные переменные объясняют больший объем вариации </w:t>
+      </w:r>
+      <w:r>
+        <w:rPr>
+          <w:rFonts w:ascii="Times New Roman" w:hAnsi="Times New Roman" w:cs="Times New Roman"/>
+          <w:sz w:val="24"/>
+          <w:szCs w:val="24"/>
+        </w:rPr>
+        <w:t>в РИ (</w:t>
+      </w:r>
+      <w:r>
+        <w:rPr>
+          <w:rFonts w:ascii="Times New Roman" w:hAnsi="Times New Roman" w:cs="Times New Roman" w:hint="eastAsia"/>
+          <w:sz w:val="24"/>
+          <w:szCs w:val="24"/>
+        </w:rPr>
+        <w:t>~</w:t>
+      </w:r>
+      <w:r>
+        <w:rPr>
+          <w:rFonts w:ascii="Times New Roman" w:hAnsi="Times New Roman" w:cs="Times New Roman"/>
+          <w:sz w:val="24"/>
+          <w:szCs w:val="24"/>
+        </w:rPr>
+        <w:t>30%</w:t>
+      </w:r>
+      <w:r>
+        <w:rPr>
+          <w:rFonts w:ascii="Times New Roman" w:hAnsi="Times New Roman" w:cs="Times New Roman"/>
+          <w:sz w:val="24"/>
+          <w:szCs w:val="24"/>
+        </w:rPr>
+        <w:t>) чем в КНР (</w:t>
+      </w:r>
+      <w:r>
+        <w:rPr>
+          <w:rFonts w:ascii="Times New Roman" w:hAnsi="Times New Roman" w:cs="Times New Roman"/>
+          <w:sz w:val="24"/>
+          <w:szCs w:val="24"/>
+        </w:rPr>
+        <w:t>~</w:t>
+      </w:r>
+      <w:r>
+        <w:rPr>
+          <w:rFonts w:ascii="Times New Roman" w:hAnsi="Times New Roman" w:cs="Times New Roman"/>
+          <w:sz w:val="24"/>
+          <w:szCs w:val="24"/>
+        </w:rPr>
+        <w:t>10%). Более того основной вес имеют разные переменные в каждой стране. Так в Инжии основную объяснительную силу несет капитализация (</w:t>
+      </w:r>
+      <w:r>
+        <w:rPr>
+          <w:rFonts w:ascii="Times New Roman" w:hAnsi="Times New Roman" w:cs="Times New Roman"/>
+          <w:sz w:val="24"/>
+          <w:szCs w:val="24"/>
+        </w:rPr>
+        <w:t>~</w:t>
+      </w:r>
+      <w:r>
+        <w:rPr>
+          <w:rFonts w:ascii="Times New Roman" w:hAnsi="Times New Roman" w:cs="Times New Roman"/>
+          <w:sz w:val="24"/>
+          <w:szCs w:val="24"/>
+        </w:rPr>
+        <w:t>15%), за которой следуют задолжность и экспорт (по 7,5% каждый), а в Китае оснвным является задолжность (</w:t>
+      </w:r>
+      <w:r>
+        <w:rPr>
+          <w:rFonts w:ascii="Times New Roman" w:hAnsi="Times New Roman" w:cs="Times New Roman"/>
+          <w:sz w:val="24"/>
+          <w:szCs w:val="24"/>
+        </w:rPr>
+        <w:t>~</w:t>
+      </w:r>
+      <w:r>
+        <w:rPr>
+          <w:rFonts w:ascii="Times New Roman" w:hAnsi="Times New Roman" w:cs="Times New Roman"/>
+          <w:sz w:val="24"/>
+          <w:szCs w:val="24"/>
+        </w:rPr>
+        <w:t>5%), далее экспорт (</w:t>
+      </w:r>
+      <w:r>
+        <w:rPr>
+          <w:rFonts w:ascii="Times New Roman" w:hAnsi="Times New Roman" w:cs="Times New Roman"/>
+          <w:sz w:val="24"/>
+          <w:szCs w:val="24"/>
+        </w:rPr>
+        <w:t>~</w:t>
+      </w:r>
+      <w:r>
+        <w:rPr>
+          <w:rFonts w:ascii="Times New Roman" w:hAnsi="Times New Roman" w:cs="Times New Roman"/>
+          <w:sz w:val="24"/>
+          <w:szCs w:val="24"/>
+        </w:rPr>
+        <w:t>3%) и капитализация (</w:t>
+      </w:r>
+      <w:r>
+        <w:rPr>
+          <w:rFonts w:ascii="Times New Roman" w:hAnsi="Times New Roman" w:cs="Times New Roman"/>
+          <w:sz w:val="24"/>
+          <w:szCs w:val="24"/>
+        </w:rPr>
+        <w:t>~</w:t>
+      </w:r>
+      <w:r>
+        <w:rPr>
+          <w:rFonts w:ascii="Times New Roman" w:hAnsi="Times New Roman" w:cs="Times New Roman"/>
+          <w:sz w:val="24"/>
+          <w:szCs w:val="24"/>
+        </w:rPr>
+        <w:t>2%).</w:t>
       </w:r>
     </w:p>
     <w:p>
@@ -635,7 +902,15 @@
           <w:sz w:val="24"/>
           <w:szCs w:val="24"/>
         </w:rPr>
-        <w:t>Разложение дисперсии показало, что, несмотря на схожий вклад фондового рынка в объяснение ВВП (чуть более 30% в обеих странах), структура этого вклада принципиально различна. В Индии рыночная капитализация и объем торгов являются основными факторами с первого лага. В Китае распределение влияния иное: оборот доминирует в первых двух кварталах, а объем торгов начинает преобладать с третьего квартала.</w:t>
+        <w:t>Долгосрочные и краткосрочные взаимосвязи между фондовым рынком, макроэкономическими показателями и экономическим ростом в Индии и Китае имеют принципиально разную структуру и силу, что подтверждает наличие страновой специфики в механизмах трансмиссии финансовых импульсов в реальный сектор.</w:t>
+      </w:r>
+      <w:r>
+        <w:rPr>
+          <w:rFonts w:ascii="Times New Roman" w:hAnsi="Times New Roman" w:cs="Times New Roman"/>
+          <w:sz w:val="24"/>
+          <w:szCs w:val="24"/>
+        </w:rPr>
+        <w:t xml:space="preserve"> </w:t>
       </w:r>
     </w:p>
     <w:p>
@@ -644,55 +919,19 @@
         <w:ind w:firstLine="708"/>
         <w:jc w:val="both"/>
         <w:rPr>
-          <w:rFonts w:ascii="Times New Roman" w:hAnsi="Times New Roman" w:cs="Times New Roman"/>
-          <w:sz w:val="24"/>
-          <w:szCs w:val="24"/>
-        </w:rPr>
-      </w:pPr>
-      <w:r>
-        <w:rPr>
-          <w:rFonts w:ascii="Times New Roman" w:hAnsi="Times New Roman" w:cs="Times New Roman"/>
-          <w:sz w:val="24"/>
-          <w:szCs w:val="24"/>
-        </w:rPr>
-        <w:t>Исследование подтверждает, что развитие фондового рынка имеет важное значение для э</w:t>
-      </w:r>
-      <w:r>
-        <w:rPr>
-          <w:rFonts w:ascii="Times New Roman" w:hAnsi="Times New Roman" w:cs="Times New Roman"/>
-          <w:sz w:val="24"/>
-          <w:szCs w:val="24"/>
-        </w:rPr>
-        <w:t>кономик как Индии, так и Китая</w:t>
-      </w:r>
+          <w:rFonts w:ascii="Times New Roman" w:eastAsia="Palatino Linotype" w:hAnsi="Times New Roman" w:cs="Times New Roman"/>
+          <w:b/>
+          <w:bCs/>
+          <w:sz w:val="24"/>
+          <w:szCs w:val="24"/>
+        </w:rPr>
+      </w:pPr>
       <w:bookmarkStart w:id="0" w:name="_GoBack"/>
       <w:bookmarkEnd w:id="0"/>
-      <w:r>
-        <w:rPr>
-          <w:rFonts w:ascii="Times New Roman" w:hAnsi="Times New Roman" w:cs="Times New Roman"/>
-          <w:sz w:val="24"/>
-          <w:szCs w:val="24"/>
-        </w:rPr>
-        <w:t>, но единого рецепта успеха не существует. Влияние одних и тех же финансовых показателей может значительно различаться в разных странах, что подчеркивает необходимость разработки экономической политики, адаптированной к национальной специфике, а не универсального подхода.</w:t>
-      </w:r>
     </w:p>
     <w:p>
       <w:pPr>
-        <w:pStyle w:val="1"/>
-        <w:spacing w:before="0" w:line="360" w:lineRule="auto"/>
-        <w:rPr>
-          <w:rFonts w:ascii="Times New Roman" w:eastAsia="Palatino Linotype" w:hAnsi="Times New Roman" w:cs="Times New Roman"/>
-          <w:b/>
-          <w:bCs/>
-          <w:color w:val="auto"/>
-          <w:sz w:val="24"/>
-          <w:szCs w:val="24"/>
-        </w:rPr>
-      </w:pPr>
-    </w:p>
-    <w:p>
-      <w:pPr>
-        <w:pStyle w:val="1"/>
+        <w:pStyle w:val="Heading1"/>
         <w:spacing w:before="0" w:line="360" w:lineRule="auto"/>
         <w:rPr>
           <w:rFonts w:ascii="Times New Roman" w:eastAsia="Palatino Linotype" w:hAnsi="Times New Roman" w:cs="Times New Roman"/>
@@ -750,6 +989,7 @@
           <w:lang w:val="en-US"/>
         </w:rPr>
       </w:pPr>
+      <w:proofErr w:type="spellStart"/>
       <w:r>
         <w:rPr>
           <w:rFonts w:ascii="Times New Roman" w:eastAsia="Palatino Linotype" w:hAnsi="Times New Roman" w:cs="Times New Roman"/>
@@ -758,7 +998,18 @@
           <w:szCs w:val="24"/>
           <w:lang w:val="en-US"/>
         </w:rPr>
-        <w:t>Haokip N.</w:t>
+        <w:t>Haokip</w:t>
+      </w:r>
+      <w:proofErr w:type="spellEnd"/>
+      <w:r>
+        <w:rPr>
+          <w:rFonts w:ascii="Times New Roman" w:eastAsia="Palatino Linotype" w:hAnsi="Times New Roman" w:cs="Times New Roman"/>
+          <w:i/>
+          <w:sz w:val="24"/>
+          <w:szCs w:val="24"/>
+          <w:lang w:val="en-US"/>
+        </w:rPr>
+        <w:t xml:space="preserve"> N.</w:t>
       </w:r>
       <w:r>
         <w:rPr>
@@ -980,6 +1231,7 @@
           <w:lang w:val="en-US"/>
         </w:rPr>
       </w:pPr>
+      <w:proofErr w:type="spellStart"/>
       <w:r>
         <w:rPr>
           <w:rFonts w:ascii="Times New Roman" w:eastAsia="Palatino Linotype" w:hAnsi="Times New Roman" w:cs="Times New Roman"/>
@@ -988,7 +1240,40 @@
           <w:szCs w:val="24"/>
           <w:lang w:val="en-US"/>
         </w:rPr>
-        <w:t>Palamalai S., Prakasam K.</w:t>
+        <w:t>Palamalai</w:t>
+      </w:r>
+      <w:proofErr w:type="spellEnd"/>
+      <w:r>
+        <w:rPr>
+          <w:rFonts w:ascii="Times New Roman" w:eastAsia="Palatino Linotype" w:hAnsi="Times New Roman" w:cs="Times New Roman"/>
+          <w:i/>
+          <w:sz w:val="24"/>
+          <w:szCs w:val="24"/>
+          <w:lang w:val="en-US"/>
+        </w:rPr>
+        <w:t xml:space="preserve"> S., </w:t>
+      </w:r>
+      <w:proofErr w:type="spellStart"/>
+      <w:r>
+        <w:rPr>
+          <w:rFonts w:ascii="Times New Roman" w:eastAsia="Palatino Linotype" w:hAnsi="Times New Roman" w:cs="Times New Roman"/>
+          <w:i/>
+          <w:sz w:val="24"/>
+          <w:szCs w:val="24"/>
+          <w:lang w:val="en-US"/>
+        </w:rPr>
+        <w:t>Prakasam</w:t>
+      </w:r>
+      <w:proofErr w:type="spellEnd"/>
+      <w:r>
+        <w:rPr>
+          <w:rFonts w:ascii="Times New Roman" w:eastAsia="Palatino Linotype" w:hAnsi="Times New Roman" w:cs="Times New Roman"/>
+          <w:i/>
+          <w:sz w:val="24"/>
+          <w:szCs w:val="24"/>
+          <w:lang w:val="en-US"/>
+        </w:rPr>
+        <w:t xml:space="preserve"> K.</w:t>
       </w:r>
       <w:r>
         <w:rPr>
@@ -1017,6 +1302,7 @@
         <w:spacing w:after="0" w:line="360" w:lineRule="auto"/>
         <w:jc w:val="both"/>
         <w:rPr>
+          <w:rStyle w:val="a"/>
           <w:rFonts w:ascii="Times New Roman" w:eastAsia="Palatino Linotype" w:hAnsi="Times New Roman" w:cs="Times New Roman"/>
           <w:sz w:val="24"/>
           <w:szCs w:val="24"/>
@@ -1068,8 +1354,19 @@
           <w:szCs w:val="24"/>
           <w:lang w:val="en-US"/>
         </w:rPr>
-        <w:t xml:space="preserve"> Economic Modelling</w:t>
-      </w:r>
+        <w:t xml:space="preserve"> Economic </w:t>
+      </w:r>
+      <w:proofErr w:type="spellStart"/>
+      <w:r>
+        <w:rPr>
+          <w:rFonts w:ascii="Times New Roman" w:eastAsia="Palatino Linotype" w:hAnsi="Times New Roman" w:cs="Times New Roman"/>
+          <w:sz w:val="24"/>
+          <w:szCs w:val="24"/>
+          <w:lang w:val="en-US"/>
+        </w:rPr>
+        <w:t>Modelling</w:t>
+      </w:r>
+      <w:proofErr w:type="spellEnd"/>
       <w:r>
         <w:rPr>
           <w:rFonts w:ascii="Times New Roman" w:eastAsia="Palatino Linotype" w:hAnsi="Times New Roman" w:cs="Times New Roman"/>
@@ -1124,19 +1421,6 @@
         </w:rPr>
         <w:t>10.1016/j.econmod.2017.07.005.</w:t>
       </w:r>
-    </w:p>
-    <w:p>
-      <w:pPr>
-        <w:spacing w:after="0" w:line="360" w:lineRule="auto"/>
-        <w:jc w:val="both"/>
-        <w:rPr>
-          <w:rStyle w:val="a4"/>
-          <w:rFonts w:ascii="Times New Roman" w:eastAsia="Palatino Linotype" w:hAnsi="Times New Roman" w:cs="Times New Roman"/>
-          <w:sz w:val="24"/>
-          <w:szCs w:val="24"/>
-          <w:lang w:val="en-US"/>
-        </w:rPr>
-      </w:pPr>
     </w:p>
     <w:sectPr>
       <w:pgSz w:w="11906" w:h="16838"/>
@@ -1149,7 +1433,7 @@
 </file>
 
 <file path=word/endnotes.xml><?xml version="1.0" encoding="utf-8"?>
-<w:endnotes xmlns:wpc="http://schemas.microsoft.com/office/word/2010/wordprocessingCanvas" xmlns:cx="http://schemas.microsoft.com/office/drawing/2014/chartex" xmlns:cx1="http://schemas.microsoft.com/office/drawing/2015/9/8/chartex" xmlns:mc="http://schemas.openxmlformats.org/markup-compatibility/2006" xmlns:o="urn:schemas-microsoft-com:office:office" xmlns:r="http://schemas.openxmlformats.org/officeDocument/2006/relationships" xmlns:m="http://schemas.openxmlformats.org/officeDocument/2006/math" xmlns:v="urn:schemas-microsoft-com:vml" xmlns:wp14="http://schemas.microsoft.com/office/word/2010/wordprocessingDrawing" xmlns:wp="http://schemas.openxmlformats.org/drawingml/2006/wordprocessingDrawing" xmlns:w10="urn:schemas-microsoft-com:office:word" xmlns:w="http://schemas.openxmlformats.org/wordprocessingml/2006/main" xmlns:w14="http://schemas.microsoft.com/office/word/2010/wordml" xmlns:w15="http://schemas.microsoft.com/office/word/2012/wordml" xmlns:w16se="http://schemas.microsoft.com/office/word/2015/wordml/symex" xmlns:wpg="http://schemas.microsoft.com/office/word/2010/wordprocessingGroup" xmlns:wpi="http://schemas.microsoft.com/office/word/2010/wordprocessingInk" xmlns:wne="http://schemas.microsoft.com/office/word/2006/wordml" xmlns:wps="http://schemas.microsoft.com/office/word/2010/wordprocessingShape" mc:Ignorable="w14 w15 w16se wp14">
+<w:endnotes xmlns:wpc="http://schemas.microsoft.com/office/word/2010/wordprocessingCanvas" xmlns:mc="http://schemas.openxmlformats.org/markup-compatibility/2006" xmlns:o="urn:schemas-microsoft-com:office:office" xmlns:r="http://schemas.openxmlformats.org/officeDocument/2006/relationships" xmlns:m="http://schemas.openxmlformats.org/officeDocument/2006/math" xmlns:v="urn:schemas-microsoft-com:vml" xmlns:wp14="http://schemas.microsoft.com/office/word/2010/wordprocessingDrawing" xmlns:wp="http://schemas.openxmlformats.org/drawingml/2006/wordprocessingDrawing" xmlns:w10="urn:schemas-microsoft-com:office:word" xmlns:w="http://schemas.openxmlformats.org/wordprocessingml/2006/main" xmlns:w14="http://schemas.microsoft.com/office/word/2010/wordml" xmlns:wpg="http://schemas.microsoft.com/office/word/2010/wordprocessingGroup" xmlns:wpi="http://schemas.microsoft.com/office/word/2010/wordprocessingInk" xmlns:wne="http://schemas.microsoft.com/office/word/2006/wordml" xmlns:wps="http://schemas.microsoft.com/office/word/2010/wordprocessingShape" mc:Ignorable="w14 wp14">
   <w:endnote w:type="separator" w:id="-1">
     <w:p>
       <w:pPr>
@@ -1174,7 +1458,7 @@
 </file>
 
 <file path=word/footnotes.xml><?xml version="1.0" encoding="utf-8"?>
-<w:footnotes xmlns:wpc="http://schemas.microsoft.com/office/word/2010/wordprocessingCanvas" xmlns:cx="http://schemas.microsoft.com/office/drawing/2014/chartex" xmlns:cx1="http://schemas.microsoft.com/office/drawing/2015/9/8/chartex" xmlns:mc="http://schemas.openxmlformats.org/markup-compatibility/2006" xmlns:o="urn:schemas-microsoft-com:office:office" xmlns:r="http://schemas.openxmlformats.org/officeDocument/2006/relationships" xmlns:m="http://schemas.openxmlformats.org/officeDocument/2006/math" xmlns:v="urn:schemas-microsoft-com:vml" xmlns:wp14="http://schemas.microsoft.com/office/word/2010/wordprocessingDrawing" xmlns:wp="http://schemas.openxmlformats.org/drawingml/2006/wordprocessingDrawing" xmlns:w10="urn:schemas-microsoft-com:office:word" xmlns:w="http://schemas.openxmlformats.org/wordprocessingml/2006/main" xmlns:w14="http://schemas.microsoft.com/office/word/2010/wordml" xmlns:w15="http://schemas.microsoft.com/office/word/2012/wordml" xmlns:w16se="http://schemas.microsoft.com/office/word/2015/wordml/symex" xmlns:wpg="http://schemas.microsoft.com/office/word/2010/wordprocessingGroup" xmlns:wpi="http://schemas.microsoft.com/office/word/2010/wordprocessingInk" xmlns:wne="http://schemas.microsoft.com/office/word/2006/wordml" xmlns:wps="http://schemas.microsoft.com/office/word/2010/wordprocessingShape" mc:Ignorable="w14 w15 w16se wp14">
+<w:footnotes xmlns:wpc="http://schemas.microsoft.com/office/word/2010/wordprocessingCanvas" xmlns:mc="http://schemas.openxmlformats.org/markup-compatibility/2006" xmlns:o="urn:schemas-microsoft-com:office:office" xmlns:r="http://schemas.openxmlformats.org/officeDocument/2006/relationships" xmlns:m="http://schemas.openxmlformats.org/officeDocument/2006/math" xmlns:v="urn:schemas-microsoft-com:vml" xmlns:wp14="http://schemas.microsoft.com/office/word/2010/wordprocessingDrawing" xmlns:wp="http://schemas.openxmlformats.org/drawingml/2006/wordprocessingDrawing" xmlns:w10="urn:schemas-microsoft-com:office:word" xmlns:w="http://schemas.openxmlformats.org/wordprocessingml/2006/main" xmlns:w14="http://schemas.microsoft.com/office/word/2010/wordml" xmlns:wpg="http://schemas.microsoft.com/office/word/2010/wordprocessingGroup" xmlns:wpi="http://schemas.microsoft.com/office/word/2010/wordprocessingInk" xmlns:wne="http://schemas.microsoft.com/office/word/2006/wordml" xmlns:wps="http://schemas.microsoft.com/office/word/2010/wordprocessingShape" mc:Ignorable="w14 wp14">
   <w:footnote w:type="separator" w:id="-1">
     <w:p>
       <w:pPr>
@@ -1199,8 +1483,8 @@
 </file>
 
 <file path=word/numbering.xml><?xml version="1.0" encoding="utf-8"?>
-<w:numbering xmlns:wpc="http://schemas.microsoft.com/office/word/2010/wordprocessingCanvas" xmlns:cx="http://schemas.microsoft.com/office/drawing/2014/chartex" xmlns:cx1="http://schemas.microsoft.com/office/drawing/2015/9/8/chartex" xmlns:mc="http://schemas.openxmlformats.org/markup-compatibility/2006" xmlns:o="urn:schemas-microsoft-com:office:office" xmlns:r="http://schemas.openxmlformats.org/officeDocument/2006/relationships" xmlns:m="http://schemas.openxmlformats.org/officeDocument/2006/math" xmlns:v="urn:schemas-microsoft-com:vml" xmlns:wp14="http://schemas.microsoft.com/office/word/2010/wordprocessingDrawing" xmlns:wp="http://schemas.openxmlformats.org/drawingml/2006/wordprocessingDrawing" xmlns:w10="urn:schemas-microsoft-com:office:word" xmlns:w="http://schemas.openxmlformats.org/wordprocessingml/2006/main" xmlns:w14="http://schemas.microsoft.com/office/word/2010/wordml" xmlns:w15="http://schemas.microsoft.com/office/word/2012/wordml" xmlns:w16se="http://schemas.microsoft.com/office/word/2015/wordml/symex" xmlns:wpg="http://schemas.microsoft.com/office/word/2010/wordprocessingGroup" xmlns:wpi="http://schemas.microsoft.com/office/word/2010/wordprocessingInk" xmlns:wne="http://schemas.microsoft.com/office/word/2006/wordml" xmlns:wps="http://schemas.microsoft.com/office/word/2010/wordprocessingShape" mc:Ignorable="w14 w15 w16se wp14">
-  <w:abstractNum w:abstractNumId="0" w15:restartNumberingAfterBreak="0">
+<w:numbering xmlns:wpc="http://schemas.microsoft.com/office/word/2010/wordprocessingCanvas" xmlns:mc="http://schemas.openxmlformats.org/markup-compatibility/2006" xmlns:o="urn:schemas-microsoft-com:office:office" xmlns:r="http://schemas.openxmlformats.org/officeDocument/2006/relationships" xmlns:m="http://schemas.openxmlformats.org/officeDocument/2006/math" xmlns:v="urn:schemas-microsoft-com:vml" xmlns:wp14="http://schemas.microsoft.com/office/word/2010/wordprocessingDrawing" xmlns:wp="http://schemas.openxmlformats.org/drawingml/2006/wordprocessingDrawing" xmlns:w10="urn:schemas-microsoft-com:office:word" xmlns:w="http://schemas.openxmlformats.org/wordprocessingml/2006/main" xmlns:w14="http://schemas.microsoft.com/office/word/2010/wordml" xmlns:wpg="http://schemas.microsoft.com/office/word/2010/wordprocessingGroup" xmlns:wpi="http://schemas.microsoft.com/office/word/2010/wordprocessingInk" xmlns:wne="http://schemas.microsoft.com/office/word/2006/wordml" xmlns:wps="http://schemas.microsoft.com/office/word/2010/wordprocessingShape" mc:Ignorable="w14 wp14">
+  <w:abstractNum w:abstractNumId="0">
     <w:nsid w:val="2AC62A80"/>
     <w:multiLevelType w:val="hybridMultilevel"/>
     <w:tmpl w:val="378C6E7C"/>
@@ -1431,7 +1715,7 @@
       </w:rPr>
     </w:lvl>
   </w:abstractNum>
-  <w:abstractNum w:abstractNumId="1" w15:restartNumberingAfterBreak="0">
+  <w:abstractNum w:abstractNumId="1">
     <w:nsid w:val="6A924008"/>
     <w:multiLevelType w:val="hybridMultilevel"/>
     <w:tmpl w:val="378C6E7C"/>
@@ -1447,7 +1731,7 @@
 </file>
 
 <file path=word/styles.xml><?xml version="1.0" encoding="utf-8"?>
-<w:styles xmlns:mc="http://schemas.openxmlformats.org/markup-compatibility/2006" xmlns:r="http://schemas.openxmlformats.org/officeDocument/2006/relationships" xmlns:w="http://schemas.openxmlformats.org/wordprocessingml/2006/main" xmlns:w14="http://schemas.microsoft.com/office/word/2010/wordml" xmlns:w15="http://schemas.microsoft.com/office/word/2012/wordml" xmlns:w16se="http://schemas.microsoft.com/office/word/2015/wordml/symex" mc:Ignorable="w14 w15 w16se">
+<w:styles xmlns:mc="http://schemas.openxmlformats.org/markup-compatibility/2006" xmlns:r="http://schemas.openxmlformats.org/officeDocument/2006/relationships" xmlns:w="http://schemas.openxmlformats.org/wordprocessingml/2006/main" xmlns:w14="http://schemas.microsoft.com/office/word/2010/wordml" mc:Ignorable="w14">
   <w:docDefaults>
     <w:rPrDefault>
       <w:rPr>
@@ -1463,388 +1747,154 @@
       </w:pPr>
     </w:pPrDefault>
   </w:docDefaults>
-  <w:latentStyles w:defLockedState="0" w:defUIPriority="99" w:defSemiHidden="0" w:defUnhideWhenUsed="0" w:defQFormat="0" w:count="371">
-    <w:lsdException w:name="Normal" w:uiPriority="0" w:qFormat="1"/>
-    <w:lsdException w:name="heading 1" w:uiPriority="0" w:qFormat="1"/>
-    <w:lsdException w:name="heading 2" w:semiHidden="1" w:uiPriority="9" w:unhideWhenUsed="1" w:qFormat="1"/>
-    <w:lsdException w:name="heading 3" w:semiHidden="1" w:uiPriority="9" w:unhideWhenUsed="1" w:qFormat="1"/>
-    <w:lsdException w:name="heading 4" w:semiHidden="1" w:uiPriority="9" w:unhideWhenUsed="1" w:qFormat="1"/>
-    <w:lsdException w:name="heading 5" w:semiHidden="1" w:uiPriority="9" w:unhideWhenUsed="1" w:qFormat="1"/>
-    <w:lsdException w:name="heading 6" w:semiHidden="1" w:uiPriority="9" w:unhideWhenUsed="1" w:qFormat="1"/>
-    <w:lsdException w:name="heading 7" w:semiHidden="1" w:uiPriority="9" w:unhideWhenUsed="1" w:qFormat="1"/>
-    <w:lsdException w:name="heading 8" w:semiHidden="1" w:uiPriority="9" w:unhideWhenUsed="1" w:qFormat="1"/>
-    <w:lsdException w:name="heading 9" w:semiHidden="1" w:uiPriority="9" w:unhideWhenUsed="1" w:qFormat="1"/>
-    <w:lsdException w:name="index 1" w:semiHidden="1" w:unhideWhenUsed="1"/>
-    <w:lsdException w:name="index 2" w:semiHidden="1" w:unhideWhenUsed="1"/>
-    <w:lsdException w:name="index 3" w:semiHidden="1" w:unhideWhenUsed="1"/>
-    <w:lsdException w:name="index 4" w:semiHidden="1" w:unhideWhenUsed="1"/>
-    <w:lsdException w:name="index 5" w:semiHidden="1" w:unhideWhenUsed="1"/>
-    <w:lsdException w:name="index 6" w:semiHidden="1" w:unhideWhenUsed="1"/>
-    <w:lsdException w:name="index 7" w:semiHidden="1" w:unhideWhenUsed="1"/>
-    <w:lsdException w:name="index 8" w:semiHidden="1" w:unhideWhenUsed="1"/>
-    <w:lsdException w:name="index 9" w:semiHidden="1" w:unhideWhenUsed="1"/>
-    <w:lsdException w:name="toc 1" w:semiHidden="1" w:uiPriority="39" w:unhideWhenUsed="1"/>
-    <w:lsdException w:name="toc 2" w:semiHidden="1" w:uiPriority="39" w:unhideWhenUsed="1"/>
-    <w:lsdException w:name="toc 3" w:semiHidden="1" w:uiPriority="39" w:unhideWhenUsed="1"/>
-    <w:lsdException w:name="toc 4" w:semiHidden="1" w:uiPriority="39" w:unhideWhenUsed="1"/>
-    <w:lsdException w:name="toc 5" w:semiHidden="1" w:uiPriority="39" w:unhideWhenUsed="1"/>
-    <w:lsdException w:name="toc 6" w:semiHidden="1" w:uiPriority="39" w:unhideWhenUsed="1"/>
-    <w:lsdException w:name="toc 7" w:semiHidden="1" w:uiPriority="39" w:unhideWhenUsed="1"/>
-    <w:lsdException w:name="toc 8" w:semiHidden="1" w:uiPriority="39" w:unhideWhenUsed="1"/>
-    <w:lsdException w:name="toc 9" w:semiHidden="1" w:uiPriority="39" w:unhideWhenUsed="1"/>
-    <w:lsdException w:name="Normal Indent" w:semiHidden="1" w:unhideWhenUsed="1"/>
-    <w:lsdException w:name="footnote text" w:semiHidden="1" w:unhideWhenUsed="1"/>
-    <w:lsdException w:name="annotation text" w:semiHidden="1" w:unhideWhenUsed="1"/>
-    <w:lsdException w:name="header" w:semiHidden="1" w:unhideWhenUsed="1"/>
-    <w:lsdException w:name="footer" w:semiHidden="1" w:unhideWhenUsed="1"/>
-    <w:lsdException w:name="index heading" w:semiHidden="1" w:unhideWhenUsed="1"/>
-    <w:lsdException w:name="caption" w:semiHidden="1" w:uiPriority="35" w:unhideWhenUsed="1" w:qFormat="1"/>
-    <w:lsdException w:name="table of figures" w:semiHidden="1" w:unhideWhenUsed="1"/>
-    <w:lsdException w:name="envelope address" w:semiHidden="1" w:unhideWhenUsed="1"/>
-    <w:lsdException w:name="envelope return" w:semiHidden="1" w:unhideWhenUsed="1"/>
-    <w:lsdException w:name="footnote reference" w:semiHidden="1" w:unhideWhenUsed="1"/>
-    <w:lsdException w:name="annotation reference" w:semiHidden="1" w:unhideWhenUsed="1"/>
-    <w:lsdException w:name="line number" w:semiHidden="1" w:unhideWhenUsed="1"/>
-    <w:lsdException w:name="page number" w:semiHidden="1" w:unhideWhenUsed="1"/>
-    <w:lsdException w:name="endnote reference" w:semiHidden="1" w:unhideWhenUsed="1"/>
-    <w:lsdException w:name="endnote text" w:semiHidden="1" w:unhideWhenUsed="1"/>
-    <w:lsdException w:name="table of authorities" w:semiHidden="1" w:unhideWhenUsed="1"/>
-    <w:lsdException w:name="macro" w:semiHidden="1" w:unhideWhenUsed="1"/>
-    <w:lsdException w:name="toa heading" w:semiHidden="1" w:unhideWhenUsed="1"/>
-    <w:lsdException w:name="List" w:semiHidden="1" w:unhideWhenUsed="1"/>
-    <w:lsdException w:name="List Bullet" w:semiHidden="1" w:unhideWhenUsed="1"/>
-    <w:lsdException w:name="List Number" w:semiHidden="1" w:unhideWhenUsed="1"/>
-    <w:lsdException w:name="List 2" w:semiHidden="1" w:unhideWhenUsed="1"/>
-    <w:lsdException w:name="List 3" w:semiHidden="1" w:unhideWhenUsed="1"/>
-    <w:lsdException w:name="List 4" w:semiHidden="1" w:unhideWhenUsed="1"/>
-    <w:lsdException w:name="List 5" w:semiHidden="1" w:unhideWhenUsed="1"/>
-    <w:lsdException w:name="List Bullet 2" w:semiHidden="1" w:unhideWhenUsed="1"/>
-    <w:lsdException w:name="List Bullet 3" w:semiHidden="1" w:unhideWhenUsed="1"/>
-    <w:lsdException w:name="List Bullet 4" w:semiHidden="1" w:unhideWhenUsed="1"/>
-    <w:lsdException w:name="List Bullet 5" w:semiHidden="1" w:unhideWhenUsed="1"/>
-    <w:lsdException w:name="List Number 2" w:semiHidden="1" w:unhideWhenUsed="1"/>
-    <w:lsdException w:name="List Number 3" w:semiHidden="1" w:unhideWhenUsed="1"/>
-    <w:lsdException w:name="List Number 4" w:semiHidden="1" w:unhideWhenUsed="1"/>
-    <w:lsdException w:name="List Number 5" w:semiHidden="1" w:unhideWhenUsed="1"/>
-    <w:lsdException w:name="Title" w:uiPriority="10" w:qFormat="1"/>
-    <w:lsdException w:name="Closing" w:semiHidden="1" w:unhideWhenUsed="1"/>
-    <w:lsdException w:name="Signature" w:semiHidden="1" w:unhideWhenUsed="1"/>
-    <w:lsdException w:name="Default Paragraph Font" w:semiHidden="1" w:uiPriority="1" w:unhideWhenUsed="1"/>
-    <w:lsdException w:name="Body Text" w:semiHidden="1" w:unhideWhenUsed="1"/>
-    <w:lsdException w:name="Body Text Indent" w:semiHidden="1" w:unhideWhenUsed="1"/>
-    <w:lsdException w:name="List Continue" w:semiHidden="1" w:unhideWhenUsed="1"/>
-    <w:lsdException w:name="List Continue 2" w:semiHidden="1" w:unhideWhenUsed="1"/>
-    <w:lsdException w:name="List Continue 3" w:semiHidden="1" w:unhideWhenUsed="1"/>
-    <w:lsdException w:name="List Continue 4" w:semiHidden="1" w:unhideWhenUsed="1"/>
-    <w:lsdException w:name="List Continue 5" w:semiHidden="1" w:unhideWhenUsed="1"/>
-    <w:lsdException w:name="Message Header" w:semiHidden="1" w:unhideWhenUsed="1"/>
-    <w:lsdException w:name="Subtitle" w:uiPriority="11" w:qFormat="1"/>
-    <w:lsdException w:name="Salutation" w:semiHidden="1" w:unhideWhenUsed="1"/>
-    <w:lsdException w:name="Date" w:semiHidden="1" w:unhideWhenUsed="1"/>
-    <w:lsdException w:name="Body Text First Indent" w:semiHidden="1" w:unhideWhenUsed="1"/>
-    <w:lsdException w:name="Body Text First Indent 2" w:semiHidden="1" w:unhideWhenUsed="1"/>
-    <w:lsdException w:name="Note Heading" w:semiHidden="1" w:unhideWhenUsed="1"/>
-    <w:lsdException w:name="Body Text 2" w:semiHidden="1" w:unhideWhenUsed="1"/>
-    <w:lsdException w:name="Body Text 3" w:semiHidden="1" w:unhideWhenUsed="1"/>
-    <w:lsdException w:name="Body Text Indent 2" w:semiHidden="1" w:unhideWhenUsed="1"/>
-    <w:lsdException w:name="Body Text Indent 3" w:semiHidden="1" w:unhideWhenUsed="1"/>
-    <w:lsdException w:name="Block Text" w:semiHidden="1" w:unhideWhenUsed="1"/>
-    <w:lsdException w:name="Hyperlink" w:semiHidden="1" w:unhideWhenUsed="1"/>
-    <w:lsdException w:name="FollowedHyperlink" w:semiHidden="1" w:unhideWhenUsed="1"/>
-    <w:lsdException w:name="Strong" w:uiPriority="22" w:qFormat="1"/>
-    <w:lsdException w:name="Emphasis" w:uiPriority="20" w:qFormat="1"/>
-    <w:lsdException w:name="Document Map" w:semiHidden="1" w:unhideWhenUsed="1"/>
-    <w:lsdException w:name="Plain Text" w:semiHidden="1" w:unhideWhenUsed="1"/>
-    <w:lsdException w:name="E-mail Signature" w:semiHidden="1" w:unhideWhenUsed="1"/>
-    <w:lsdException w:name="HTML Top of Form" w:semiHidden="1" w:unhideWhenUsed="1"/>
-    <w:lsdException w:name="HTML Bottom of Form" w:semiHidden="1" w:unhideWhenUsed="1"/>
-    <w:lsdException w:name="Normal (Web)" w:semiHidden="1" w:unhideWhenUsed="1"/>
-    <w:lsdException w:name="HTML Acronym" w:semiHidden="1" w:unhideWhenUsed="1"/>
-    <w:lsdException w:name="HTML Address" w:semiHidden="1" w:unhideWhenUsed="1"/>
-    <w:lsdException w:name="HTML Cite" w:semiHidden="1" w:unhideWhenUsed="1"/>
-    <w:lsdException w:name="HTML Code" w:semiHidden="1" w:unhideWhenUsed="1"/>
-    <w:lsdException w:name="HTML Definition" w:semiHidden="1" w:unhideWhenUsed="1"/>
-    <w:lsdException w:name="HTML Keyboard" w:semiHidden="1" w:unhideWhenUsed="1"/>
-    <w:lsdException w:name="HTML Preformatted" w:semiHidden="1" w:unhideWhenUsed="1"/>
-    <w:lsdException w:name="HTML Sample" w:semiHidden="1" w:unhideWhenUsed="1"/>
-    <w:lsdException w:name="HTML Typewriter" w:semiHidden="1" w:unhideWhenUsed="1"/>
-    <w:lsdException w:name="HTML Variable" w:semiHidden="1" w:unhideWhenUsed="1"/>
-    <w:lsdException w:name="Normal Table" w:semiHidden="1" w:unhideWhenUsed="1"/>
-    <w:lsdException w:name="annotation subject" w:semiHidden="1" w:unhideWhenUsed="1"/>
-    <w:lsdException w:name="No List" w:semiHidden="1" w:unhideWhenUsed="1"/>
-    <w:lsdException w:name="Outline List 1" w:semiHidden="1" w:unhideWhenUsed="1"/>
-    <w:lsdException w:name="Outline List 2" w:semiHidden="1" w:unhideWhenUsed="1"/>
-    <w:lsdException w:name="Outline List 3" w:semiHidden="1" w:unhideWhenUsed="1"/>
-    <w:lsdException w:name="Table Simple 1" w:semiHidden="1" w:unhideWhenUsed="1"/>
-    <w:lsdException w:name="Table Simple 2" w:semiHidden="1" w:unhideWhenUsed="1"/>
-    <w:lsdException w:name="Table Simple 3" w:semiHidden="1" w:unhideWhenUsed="1"/>
-    <w:lsdException w:name="Table Classic 1" w:semiHidden="1" w:unhideWhenUsed="1"/>
-    <w:lsdException w:name="Table Classic 2" w:semiHidden="1" w:unhideWhenUsed="1"/>
-    <w:lsdException w:name="Table Classic 3" w:semiHidden="1" w:unhideWhenUsed="1"/>
-    <w:lsdException w:name="Table Classic 4" w:semiHidden="1" w:unhideWhenUsed="1"/>
-    <w:lsdException w:name="Table Colorful 1" w:semiHidden="1" w:unhideWhenUsed="1"/>
-    <w:lsdException w:name="Table Colorful 2" w:semiHidden="1" w:unhideWhenUsed="1"/>
-    <w:lsdException w:name="Table Colorful 3" w:semiHidden="1" w:unhideWhenUsed="1"/>
-    <w:lsdException w:name="Table Columns 1" w:semiHidden="1" w:unhideWhenUsed="1"/>
-    <w:lsdException w:name="Table Columns 2" w:semiHidden="1" w:unhideWhenUsed="1"/>
-    <w:lsdException w:name="Table Columns 3" w:semiHidden="1" w:unhideWhenUsed="1"/>
-    <w:lsdException w:name="Table Columns 4" w:semiHidden="1" w:unhideWhenUsed="1"/>
-    <w:lsdException w:name="Table Columns 5" w:semiHidden="1" w:unhideWhenUsed="1"/>
-    <w:lsdException w:name="Table Grid 1" w:semiHidden="1" w:unhideWhenUsed="1"/>
-    <w:lsdException w:name="Table Grid 2" w:semiHidden="1" w:unhideWhenUsed="1"/>
-    <w:lsdException w:name="Table Grid 3" w:semiHidden="1" w:unhideWhenUsed="1"/>
-    <w:lsdException w:name="Table Grid 4" w:semiHidden="1" w:unhideWhenUsed="1"/>
-    <w:lsdException w:name="Table Grid 5" w:semiHidden="1" w:unhideWhenUsed="1"/>
-    <w:lsdException w:name="Table Grid 6" w:semiHidden="1" w:unhideWhenUsed="1"/>
-    <w:lsdException w:name="Table Grid 7" w:semiHidden="1" w:unhideWhenUsed="1"/>
-    <w:lsdException w:name="Table Grid 8" w:semiHidden="1" w:unhideWhenUsed="1"/>
-    <w:lsdException w:name="Table List 1" w:semiHidden="1" w:unhideWhenUsed="1"/>
-    <w:lsdException w:name="Table List 2" w:semiHidden="1" w:unhideWhenUsed="1"/>
-    <w:lsdException w:name="Table List 3" w:semiHidden="1" w:unhideWhenUsed="1"/>
-    <w:lsdException w:name="Table List 4" w:semiHidden="1" w:unhideWhenUsed="1"/>
-    <w:lsdException w:name="Table List 5" w:semiHidden="1" w:unhideWhenUsed="1"/>
-    <w:lsdException w:name="Table List 6" w:semiHidden="1" w:unhideWhenUsed="1"/>
-    <w:lsdException w:name="Table List 7" w:semiHidden="1" w:unhideWhenUsed="1"/>
-    <w:lsdException w:name="Table List 8" w:semiHidden="1" w:unhideWhenUsed="1"/>
-    <w:lsdException w:name="Table 3D effects 1" w:semiHidden="1" w:unhideWhenUsed="1"/>
-    <w:lsdException w:name="Table 3D effects 2" w:semiHidden="1" w:unhideWhenUsed="1"/>
-    <w:lsdException w:name="Table 3D effects 3" w:semiHidden="1" w:unhideWhenUsed="1"/>
-    <w:lsdException w:name="Table Contemporary" w:semiHidden="1" w:unhideWhenUsed="1"/>
-    <w:lsdException w:name="Table Elegant" w:semiHidden="1" w:unhideWhenUsed="1"/>
-    <w:lsdException w:name="Table Professional" w:semiHidden="1" w:unhideWhenUsed="1"/>
-    <w:lsdException w:name="Table Subtle 1" w:semiHidden="1" w:unhideWhenUsed="1"/>
-    <w:lsdException w:name="Table Subtle 2" w:semiHidden="1" w:unhideWhenUsed="1"/>
-    <w:lsdException w:name="Table Web 1" w:semiHidden="1" w:unhideWhenUsed="1"/>
-    <w:lsdException w:name="Table Web 2" w:semiHidden="1" w:unhideWhenUsed="1"/>
-    <w:lsdException w:name="Table Web 3" w:semiHidden="1" w:unhideWhenUsed="1"/>
-    <w:lsdException w:name="Balloon Text" w:semiHidden="1" w:unhideWhenUsed="1"/>
-    <w:lsdException w:name="Table Grid" w:uiPriority="39"/>
-    <w:lsdException w:name="Table Theme" w:semiHidden="1" w:unhideWhenUsed="1"/>
-    <w:lsdException w:name="Placeholder Text" w:semiHidden="1"/>
-    <w:lsdException w:name="No Spacing" w:uiPriority="1" w:qFormat="1"/>
-    <w:lsdException w:name="Light Shading" w:uiPriority="60"/>
-    <w:lsdException w:name="Light List" w:uiPriority="61"/>
-    <w:lsdException w:name="Light Grid" w:uiPriority="62"/>
-    <w:lsdException w:name="Medium Shading 1" w:uiPriority="63"/>
-    <w:lsdException w:name="Medium Shading 2" w:uiPriority="64"/>
-    <w:lsdException w:name="Medium List 1" w:uiPriority="65"/>
-    <w:lsdException w:name="Medium List 2" w:uiPriority="66"/>
-    <w:lsdException w:name="Medium Grid 1" w:uiPriority="67"/>
-    <w:lsdException w:name="Medium Grid 2" w:uiPriority="68"/>
-    <w:lsdException w:name="Medium Grid 3" w:uiPriority="69"/>
-    <w:lsdException w:name="Dark List" w:uiPriority="70"/>
-    <w:lsdException w:name="Colorful Shading" w:uiPriority="71"/>
-    <w:lsdException w:name="Colorful List" w:uiPriority="72"/>
-    <w:lsdException w:name="Colorful Grid" w:uiPriority="73"/>
-    <w:lsdException w:name="Light Shading Accent 1" w:uiPriority="60"/>
-    <w:lsdException w:name="Light List Accent 1" w:uiPriority="61"/>
-    <w:lsdException w:name="Light Grid Accent 1" w:uiPriority="62"/>
-    <w:lsdException w:name="Medium Shading 1 Accent 1" w:uiPriority="63"/>
-    <w:lsdException w:name="Medium Shading 2 Accent 1" w:uiPriority="64"/>
-    <w:lsdException w:name="Medium List 1 Accent 1" w:uiPriority="65"/>
-    <w:lsdException w:name="Revision" w:semiHidden="1"/>
-    <w:lsdException w:name="List Paragraph" w:uiPriority="34" w:qFormat="1"/>
-    <w:lsdException w:name="Quote" w:uiPriority="29" w:qFormat="1"/>
-    <w:lsdException w:name="Intense Quote" w:uiPriority="30" w:qFormat="1"/>
-    <w:lsdException w:name="Medium List 2 Accent 1" w:uiPriority="66"/>
-    <w:lsdException w:name="Medium Grid 1 Accent 1" w:uiPriority="67"/>
-    <w:lsdException w:name="Medium Grid 2 Accent 1" w:uiPriority="68"/>
-    <w:lsdException w:name="Medium Grid 3 Accent 1" w:uiPriority="69"/>
-    <w:lsdException w:name="Dark List Accent 1" w:uiPriority="70"/>
-    <w:lsdException w:name="Colorful Shading Accent 1" w:uiPriority="71"/>
-    <w:lsdException w:name="Colorful List Accent 1" w:uiPriority="72"/>
-    <w:lsdException w:name="Colorful Grid Accent 1" w:uiPriority="73"/>
-    <w:lsdException w:name="Light Shading Accent 2" w:uiPriority="60"/>
-    <w:lsdException w:name="Light List Accent 2" w:uiPriority="61"/>
-    <w:lsdException w:name="Light Grid Accent 2" w:uiPriority="62"/>
-    <w:lsdException w:name="Medium Shading 1 Accent 2" w:uiPriority="63"/>
-    <w:lsdException w:name="Medium Shading 2 Accent 2" w:uiPriority="64"/>
-    <w:lsdException w:name="Medium List 1 Accent 2" w:uiPriority="65"/>
-    <w:lsdException w:name="Medium List 2 Accent 2" w:uiPriority="66"/>
-    <w:lsdException w:name="Medium Grid 1 Accent 2" w:uiPriority="67"/>
-    <w:lsdException w:name="Medium Grid 2 Accent 2" w:uiPriority="68"/>
-    <w:lsdException w:name="Medium Grid 3 Accent 2" w:uiPriority="69"/>
-    <w:lsdException w:name="Dark List Accent 2" w:uiPriority="70"/>
-    <w:lsdException w:name="Colorful Shading Accent 2" w:uiPriority="71"/>
-    <w:lsdException w:name="Colorful List Accent 2" w:uiPriority="72"/>
-    <w:lsdException w:name="Colorful Grid Accent 2" w:uiPriority="73"/>
-    <w:lsdException w:name="Light Shading Accent 3" w:uiPriority="60"/>
-    <w:lsdException w:name="Light List Accent 3" w:uiPriority="61"/>
-    <w:lsdException w:name="Light Grid Accent 3" w:uiPriority="62"/>
-    <w:lsdException w:name="Medium Shading 1 Accent 3" w:uiPriority="63"/>
-    <w:lsdException w:name="Medium Shading 2 Accent 3" w:uiPriority="64"/>
-    <w:lsdException w:name="Medium List 1 Accent 3" w:uiPriority="65"/>
-    <w:lsdException w:name="Medium List 2 Accent 3" w:uiPriority="66"/>
-    <w:lsdException w:name="Medium Grid 1 Accent 3" w:uiPriority="67"/>
-    <w:lsdException w:name="Medium Grid 2 Accent 3" w:uiPriority="68"/>
-    <w:lsdException w:name="Medium Grid 3 Accent 3" w:uiPriority="69"/>
-    <w:lsdException w:name="Dark List Accent 3" w:uiPriority="70"/>
-    <w:lsdException w:name="Colorful Shading Accent 3" w:uiPriority="71"/>
-    <w:lsdException w:name="Colorful List Accent 3" w:uiPriority="72"/>
-    <w:lsdException w:name="Colorful Grid Accent 3" w:uiPriority="73"/>
-    <w:lsdException w:name="Light Shading Accent 4" w:uiPriority="60"/>
-    <w:lsdException w:name="Light List Accent 4" w:uiPriority="61"/>
-    <w:lsdException w:name="Light Grid Accent 4" w:uiPriority="62"/>
-    <w:lsdException w:name="Medium Shading 1 Accent 4" w:uiPriority="63"/>
-    <w:lsdException w:name="Medium Shading 2 Accent 4" w:uiPriority="64"/>
-    <w:lsdException w:name="Medium List 1 Accent 4" w:uiPriority="65"/>
-    <w:lsdException w:name="Medium List 2 Accent 4" w:uiPriority="66"/>
-    <w:lsdException w:name="Medium Grid 1 Accent 4" w:uiPriority="67"/>
-    <w:lsdException w:name="Medium Grid 2 Accent 4" w:uiPriority="68"/>
-    <w:lsdException w:name="Medium Grid 3 Accent 4" w:uiPriority="69"/>
-    <w:lsdException w:name="Dark List Accent 4" w:uiPriority="70"/>
-    <w:lsdException w:name="Colorful Shading Accent 4" w:uiPriority="71"/>
-    <w:lsdException w:name="Colorful List Accent 4" w:uiPriority="72"/>
-    <w:lsdException w:name="Colorful Grid Accent 4" w:uiPriority="73"/>
-    <w:lsdException w:name="Light Shading Accent 5" w:uiPriority="60"/>
-    <w:lsdException w:name="Light List Accent 5" w:uiPriority="61"/>
-    <w:lsdException w:name="Light Grid Accent 5" w:uiPriority="62"/>
-    <w:lsdException w:name="Medium Shading 1 Accent 5" w:uiPriority="63"/>
-    <w:lsdException w:name="Medium Shading 2 Accent 5" w:uiPriority="64"/>
-    <w:lsdException w:name="Medium List 1 Accent 5" w:uiPriority="65"/>
-    <w:lsdException w:name="Medium List 2 Accent 5" w:uiPriority="66"/>
-    <w:lsdException w:name="Medium Grid 1 Accent 5" w:uiPriority="67"/>
-    <w:lsdException w:name="Medium Grid 2 Accent 5" w:uiPriority="68"/>
-    <w:lsdException w:name="Medium Grid 3 Accent 5" w:uiPriority="69"/>
-    <w:lsdException w:name="Dark List Accent 5" w:uiPriority="70"/>
-    <w:lsdException w:name="Colorful Shading Accent 5" w:uiPriority="71"/>
-    <w:lsdException w:name="Colorful List Accent 5" w:uiPriority="72"/>
-    <w:lsdException w:name="Colorful Grid Accent 5" w:uiPriority="73"/>
-    <w:lsdException w:name="Light Shading Accent 6" w:uiPriority="60"/>
-    <w:lsdException w:name="Light List Accent 6" w:uiPriority="61"/>
-    <w:lsdException w:name="Light Grid Accent 6" w:uiPriority="62"/>
-    <w:lsdException w:name="Medium Shading 1 Accent 6" w:uiPriority="63"/>
-    <w:lsdException w:name="Medium Shading 2 Accent 6" w:uiPriority="64"/>
-    <w:lsdException w:name="Medium List 1 Accent 6" w:uiPriority="65"/>
-    <w:lsdException w:name="Medium List 2 Accent 6" w:uiPriority="66"/>
-    <w:lsdException w:name="Medium Grid 1 Accent 6" w:uiPriority="67"/>
-    <w:lsdException w:name="Medium Grid 2 Accent 6" w:uiPriority="68"/>
-    <w:lsdException w:name="Medium Grid 3 Accent 6" w:uiPriority="69"/>
-    <w:lsdException w:name="Dark List Accent 6" w:uiPriority="70"/>
-    <w:lsdException w:name="Colorful Shading Accent 6" w:uiPriority="71"/>
-    <w:lsdException w:name="Colorful List Accent 6" w:uiPriority="72"/>
-    <w:lsdException w:name="Colorful Grid Accent 6" w:uiPriority="73"/>
-    <w:lsdException w:name="Subtle Emphasis" w:uiPriority="19" w:qFormat="1"/>
-    <w:lsdException w:name="Intense Emphasis" w:uiPriority="21" w:qFormat="1"/>
-    <w:lsdException w:name="Subtle Reference" w:uiPriority="31" w:qFormat="1"/>
-    <w:lsdException w:name="Intense Reference" w:uiPriority="32" w:qFormat="1"/>
-    <w:lsdException w:name="Book Title" w:uiPriority="33" w:qFormat="1"/>
-    <w:lsdException w:name="Bibliography" w:semiHidden="1" w:uiPriority="37" w:unhideWhenUsed="1"/>
-    <w:lsdException w:name="TOC Heading" w:semiHidden="1" w:uiPriority="39" w:unhideWhenUsed="1" w:qFormat="1"/>
-    <w:lsdException w:name="Plain Table 1" w:uiPriority="41"/>
-    <w:lsdException w:name="Plain Table 2" w:uiPriority="42"/>
-    <w:lsdException w:name="Plain Table 3" w:uiPriority="43"/>
-    <w:lsdException w:name="Plain Table 4" w:uiPriority="44"/>
-    <w:lsdException w:name="Plain Table 5" w:uiPriority="45"/>
-    <w:lsdException w:name="Grid Table Light" w:uiPriority="40"/>
-    <w:lsdException w:name="Grid Table 1 Light" w:uiPriority="46"/>
-    <w:lsdException w:name="Grid Table 2" w:uiPriority="47"/>
-    <w:lsdException w:name="Grid Table 3" w:uiPriority="48"/>
-    <w:lsdException w:name="Grid Table 4" w:uiPriority="49"/>
-    <w:lsdException w:name="Grid Table 5 Dark" w:uiPriority="50"/>
-    <w:lsdException w:name="Grid Table 6 Colorful" w:uiPriority="51"/>
-    <w:lsdException w:name="Grid Table 7 Colorful" w:uiPriority="52"/>
-    <w:lsdException w:name="Grid Table 1 Light Accent 1" w:uiPriority="46"/>
-    <w:lsdException w:name="Grid Table 2 Accent 1" w:uiPriority="47"/>
-    <w:lsdException w:name="Grid Table 3 Accent 1" w:uiPriority="48"/>
-    <w:lsdException w:name="Grid Table 4 Accent 1" w:uiPriority="49"/>
-    <w:lsdException w:name="Grid Table 5 Dark Accent 1" w:uiPriority="50"/>
-    <w:lsdException w:name="Grid Table 6 Colorful Accent 1" w:uiPriority="51"/>
-    <w:lsdException w:name="Grid Table 7 Colorful Accent 1" w:uiPriority="52"/>
-    <w:lsdException w:name="Grid Table 1 Light Accent 2" w:uiPriority="46"/>
-    <w:lsdException w:name="Grid Table 2 Accent 2" w:uiPriority="47"/>
-    <w:lsdException w:name="Grid Table 3 Accent 2" w:uiPriority="48"/>
-    <w:lsdException w:name="Grid Table 4 Accent 2" w:uiPriority="49"/>
-    <w:lsdException w:name="Grid Table 5 Dark Accent 2" w:uiPriority="50"/>
-    <w:lsdException w:name="Grid Table 6 Colorful Accent 2" w:uiPriority="51"/>
-    <w:lsdException w:name="Grid Table 7 Colorful Accent 2" w:uiPriority="52"/>
-    <w:lsdException w:name="Grid Table 1 Light Accent 3" w:uiPriority="46"/>
-    <w:lsdException w:name="Grid Table 2 Accent 3" w:uiPriority="47"/>
-    <w:lsdException w:name="Grid Table 3 Accent 3" w:uiPriority="48"/>
-    <w:lsdException w:name="Grid Table 4 Accent 3" w:uiPriority="49"/>
-    <w:lsdException w:name="Grid Table 5 Dark Accent 3" w:uiPriority="50"/>
-    <w:lsdException w:name="Grid Table 6 Colorful Accent 3" w:uiPriority="51"/>
-    <w:lsdException w:name="Grid Table 7 Colorful Accent 3" w:uiPriority="52"/>
-    <w:lsdException w:name="Grid Table 1 Light Accent 4" w:uiPriority="46"/>
-    <w:lsdException w:name="Grid Table 2 Accent 4" w:uiPriority="47"/>
-    <w:lsdException w:name="Grid Table 3 Accent 4" w:uiPriority="48"/>
-    <w:lsdException w:name="Grid Table 4 Accent 4" w:uiPriority="49"/>
-    <w:lsdException w:name="Grid Table 5 Dark Accent 4" w:uiPriority="50"/>
-    <w:lsdException w:name="Grid Table 6 Colorful Accent 4" w:uiPriority="51"/>
-    <w:lsdException w:name="Grid Table 7 Colorful Accent 4" w:uiPriority="52"/>
-    <w:lsdException w:name="Grid Table 1 Light Accent 5" w:uiPriority="46"/>
-    <w:lsdException w:name="Grid Table 2 Accent 5" w:uiPriority="47"/>
-    <w:lsdException w:name="Grid Table 3 Accent 5" w:uiPriority="48"/>
-    <w:lsdException w:name="Grid Table 4 Accent 5" w:uiPriority="49"/>
-    <w:lsdException w:name="Grid Table 5 Dark Accent 5" w:uiPriority="50"/>
-    <w:lsdException w:name="Grid Table 6 Colorful Accent 5" w:uiPriority="51"/>
-    <w:lsdException w:name="Grid Table 7 Colorful Accent 5" w:uiPriority="52"/>
-    <w:lsdException w:name="Grid Table 1 Light Accent 6" w:uiPriority="46"/>
-    <w:lsdException w:name="Grid Table 2 Accent 6" w:uiPriority="47"/>
-    <w:lsdException w:name="Grid Table 3 Accent 6" w:uiPriority="48"/>
-    <w:lsdException w:name="Grid Table 4 Accent 6" w:uiPriority="49"/>
-    <w:lsdException w:name="Grid Table 5 Dark Accent 6" w:uiPriority="50"/>
-    <w:lsdException w:name="Grid Table 6 Colorful Accent 6" w:uiPriority="51"/>
-    <w:lsdException w:name="Grid Table 7 Colorful Accent 6" w:uiPriority="52"/>
-    <w:lsdException w:name="List Table 1 Light" w:uiPriority="46"/>
-    <w:lsdException w:name="List Table 2" w:uiPriority="47"/>
-    <w:lsdException w:name="List Table 3" w:uiPriority="48"/>
-    <w:lsdException w:name="List Table 4" w:uiPriority="49"/>
-    <w:lsdException w:name="List Table 5 Dark" w:uiPriority="50"/>
-    <w:lsdException w:name="List Table 6 Colorful" w:uiPriority="51"/>
-    <w:lsdException w:name="List Table 7 Colorful" w:uiPriority="52"/>
-    <w:lsdException w:name="List Table 1 Light Accent 1" w:uiPriority="46"/>
-    <w:lsdException w:name="List Table 2 Accent 1" w:uiPriority="47"/>
-    <w:lsdException w:name="List Table 3 Accent 1" w:uiPriority="48"/>
-    <w:lsdException w:name="List Table 4 Accent 1" w:uiPriority="49"/>
-    <w:lsdException w:name="List Table 5 Dark Accent 1" w:uiPriority="50"/>
-    <w:lsdException w:name="List Table 6 Colorful Accent 1" w:uiPriority="51"/>
-    <w:lsdException w:name="List Table 7 Colorful Accent 1" w:uiPriority="52"/>
-    <w:lsdException w:name="List Table 1 Light Accent 2" w:uiPriority="46"/>
-    <w:lsdException w:name="List Table 2 Accent 2" w:uiPriority="47"/>
-    <w:lsdException w:name="List Table 3 Accent 2" w:uiPriority="48"/>
-    <w:lsdException w:name="List Table 4 Accent 2" w:uiPriority="49"/>
-    <w:lsdException w:name="List Table 5 Dark Accent 2" w:uiPriority="50"/>
-    <w:lsdException w:name="List Table 6 Colorful Accent 2" w:uiPriority="51"/>
-    <w:lsdException w:name="List Table 7 Colorful Accent 2" w:uiPriority="52"/>
-    <w:lsdException w:name="List Table 1 Light Accent 3" w:uiPriority="46"/>
-    <w:lsdException w:name="List Table 2 Accent 3" w:uiPriority="47"/>
-    <w:lsdException w:name="List Table 3 Accent 3" w:uiPriority="48"/>
-    <w:lsdException w:name="List Table 4 Accent 3" w:uiPriority="49"/>
-    <w:lsdException w:name="List Table 5 Dark Accent 3" w:uiPriority="50"/>
-    <w:lsdException w:name="List Table 6 Colorful Accent 3" w:uiPriority="51"/>
-    <w:lsdException w:name="List Table 7 Colorful Accent 3" w:uiPriority="52"/>
-    <w:lsdException w:name="List Table 1 Light Accent 4" w:uiPriority="46"/>
-    <w:lsdException w:name="List Table 2 Accent 4" w:uiPriority="47"/>
-    <w:lsdException w:name="List Table 3 Accent 4" w:uiPriority="48"/>
-    <w:lsdException w:name="List Table 4 Accent 4" w:uiPriority="49"/>
-    <w:lsdException w:name="List Table 5 Dark Accent 4" w:uiPriority="50"/>
-    <w:lsdException w:name="List Table 6 Colorful Accent 4" w:uiPriority="51"/>
-    <w:lsdException w:name="List Table 7 Colorful Accent 4" w:uiPriority="52"/>
-    <w:lsdException w:name="List Table 1 Light Accent 5" w:uiPriority="46"/>
-    <w:lsdException w:name="List Table 2 Accent 5" w:uiPriority="47"/>
-    <w:lsdException w:name="List Table 3 Accent 5" w:uiPriority="48"/>
-    <w:lsdException w:name="List Table 4 Accent 5" w:uiPriority="49"/>
-    <w:lsdException w:name="List Table 5 Dark Accent 5" w:uiPriority="50"/>
-    <w:lsdException w:name="List Table 6 Colorful Accent 5" w:uiPriority="51"/>
-    <w:lsdException w:name="List Table 7 Colorful Accent 5" w:uiPriority="52"/>
-    <w:lsdException w:name="List Table 1 Light Accent 6" w:uiPriority="46"/>
-    <w:lsdException w:name="List Table 2 Accent 6" w:uiPriority="47"/>
-    <w:lsdException w:name="List Table 3 Accent 6" w:uiPriority="48"/>
-    <w:lsdException w:name="List Table 4 Accent 6" w:uiPriority="49"/>
-    <w:lsdException w:name="List Table 5 Dark Accent 6" w:uiPriority="50"/>
-    <w:lsdException w:name="List Table 6 Colorful Accent 6" w:uiPriority="51"/>
-    <w:lsdException w:name="List Table 7 Colorful Accent 6" w:uiPriority="52"/>
+  <w:latentStyles w:defLockedState="0" w:defUIPriority="99" w:defSemiHidden="1" w:defUnhideWhenUsed="1" w:defQFormat="0" w:count="267">
+    <w:lsdException w:name="Normal" w:semiHidden="0" w:uiPriority="0" w:unhideWhenUsed="0" w:qFormat="1"/>
+    <w:lsdException w:name="heading 1" w:semiHidden="0" w:uiPriority="0" w:unhideWhenUsed="0" w:qFormat="1"/>
+    <w:lsdException w:name="heading 2" w:uiPriority="9" w:qFormat="1"/>
+    <w:lsdException w:name="heading 3" w:uiPriority="9" w:qFormat="1"/>
+    <w:lsdException w:name="heading 4" w:uiPriority="9" w:qFormat="1"/>
+    <w:lsdException w:name="heading 5" w:uiPriority="9" w:qFormat="1"/>
+    <w:lsdException w:name="heading 6" w:uiPriority="9" w:qFormat="1"/>
+    <w:lsdException w:name="heading 7" w:uiPriority="9" w:qFormat="1"/>
+    <w:lsdException w:name="heading 8" w:uiPriority="9" w:qFormat="1"/>
+    <w:lsdException w:name="heading 9" w:uiPriority="9" w:qFormat="1"/>
+    <w:lsdException w:name="toc 1" w:uiPriority="39"/>
+    <w:lsdException w:name="toc 2" w:uiPriority="39"/>
+    <w:lsdException w:name="toc 3" w:uiPriority="39"/>
+    <w:lsdException w:name="toc 4" w:uiPriority="39"/>
+    <w:lsdException w:name="toc 5" w:uiPriority="39"/>
+    <w:lsdException w:name="toc 6" w:uiPriority="39"/>
+    <w:lsdException w:name="toc 7" w:uiPriority="39"/>
+    <w:lsdException w:name="toc 8" w:uiPriority="39"/>
+    <w:lsdException w:name="toc 9" w:uiPriority="39"/>
+    <w:lsdException w:name="caption" w:uiPriority="35" w:qFormat="1"/>
+    <w:lsdException w:name="Title" w:semiHidden="0" w:uiPriority="10" w:unhideWhenUsed="0" w:qFormat="1"/>
+    <w:lsdException w:name="Default Paragraph Font" w:uiPriority="1"/>
+    <w:lsdException w:name="Subtitle" w:semiHidden="0" w:uiPriority="11" w:unhideWhenUsed="0" w:qFormat="1"/>
+    <w:lsdException w:name="Strong" w:semiHidden="0" w:uiPriority="22" w:unhideWhenUsed="0" w:qFormat="1"/>
+    <w:lsdException w:name="Emphasis" w:semiHidden="0" w:uiPriority="20" w:unhideWhenUsed="0" w:qFormat="1"/>
+    <w:lsdException w:name="Table Grid" w:semiHidden="0" w:uiPriority="39" w:unhideWhenUsed="0"/>
+    <w:lsdException w:name="Placeholder Text" w:unhideWhenUsed="0"/>
+    <w:lsdException w:name="No Spacing" w:semiHidden="0" w:uiPriority="1" w:unhideWhenUsed="0" w:qFormat="1"/>
+    <w:lsdException w:name="Light Shading" w:semiHidden="0" w:uiPriority="60" w:unhideWhenUsed="0"/>
+    <w:lsdException w:name="Light List" w:semiHidden="0" w:uiPriority="61" w:unhideWhenUsed="0"/>
+    <w:lsdException w:name="Light Grid" w:semiHidden="0" w:uiPriority="62" w:unhideWhenUsed="0"/>
+    <w:lsdException w:name="Medium Shading 1" w:semiHidden="0" w:uiPriority="63" w:unhideWhenUsed="0"/>
+    <w:lsdException w:name="Medium Shading 2" w:semiHidden="0" w:uiPriority="64" w:unhideWhenUsed="0"/>
+    <w:lsdException w:name="Medium List 1" w:semiHidden="0" w:uiPriority="65" w:unhideWhenUsed="0"/>
+    <w:lsdException w:name="Medium List 2" w:semiHidden="0" w:uiPriority="66" w:unhideWhenUsed="0"/>
+    <w:lsdException w:name="Medium Grid 1" w:semiHidden="0" w:uiPriority="67" w:unhideWhenUsed="0"/>
+    <w:lsdException w:name="Medium Grid 2" w:semiHidden="0" w:uiPriority="68" w:unhideWhenUsed="0"/>
+    <w:lsdException w:name="Medium Grid 3" w:semiHidden="0" w:uiPriority="69" w:unhideWhenUsed="0"/>
+    <w:lsdException w:name="Dark List" w:semiHidden="0" w:uiPriority="70" w:unhideWhenUsed="0"/>
+    <w:lsdException w:name="Colorful Shading" w:semiHidden="0" w:uiPriority="71" w:unhideWhenUsed="0"/>
+    <w:lsdException w:name="Colorful List" w:semiHidden="0" w:uiPriority="72" w:unhideWhenUsed="0"/>
+    <w:lsdException w:name="Colorful Grid" w:semiHidden="0" w:uiPriority="73" w:unhideWhenUsed="0"/>
+    <w:lsdException w:name="Light Shading Accent 1" w:semiHidden="0" w:uiPriority="60" w:unhideWhenUsed="0"/>
+    <w:lsdException w:name="Light List Accent 1" w:semiHidden="0" w:uiPriority="61" w:unhideWhenUsed="0"/>
+    <w:lsdException w:name="Light Grid Accent 1" w:semiHidden="0" w:uiPriority="62" w:unhideWhenUsed="0"/>
+    <w:lsdException w:name="Medium Shading 1 Accent 1" w:semiHidden="0" w:uiPriority="63" w:unhideWhenUsed="0"/>
+    <w:lsdException w:name="Medium Shading 2 Accent 1" w:semiHidden="0" w:uiPriority="64" w:unhideWhenUsed="0"/>
+    <w:lsdException w:name="Medium List 1 Accent 1" w:semiHidden="0" w:uiPriority="65" w:unhideWhenUsed="0"/>
+    <w:lsdException w:name="Revision" w:unhideWhenUsed="0"/>
+    <w:lsdException w:name="List Paragraph" w:semiHidden="0" w:uiPriority="34" w:unhideWhenUsed="0" w:qFormat="1"/>
+    <w:lsdException w:name="Quote" w:semiHidden="0" w:uiPriority="29" w:unhideWhenUsed="0" w:qFormat="1"/>
+    <w:lsdException w:name="Intense Quote" w:semiHidden="0" w:uiPriority="30" w:unhideWhenUsed="0" w:qFormat="1"/>
+    <w:lsdException w:name="Medium List 2 Accent 1" w:semiHidden="0" w:uiPriority="66" w:unhideWhenUsed="0"/>
+    <w:lsdException w:name="Medium Grid 1 Accent 1" w:semiHidden="0" w:uiPriority="67" w:unhideWhenUsed="0"/>
+    <w:lsdException w:name="Medium Grid 2 Accent 1" w:semiHidden="0" w:uiPriority="68" w:unhideWhenUsed="0"/>
+    <w:lsdException w:name="Medium Grid 3 Accent 1" w:semiHidden="0" w:uiPriority="69" w:unhideWhenUsed="0"/>
+    <w:lsdException w:name="Dark List Accent 1" w:semiHidden="0" w:uiPriority="70" w:unhideWhenUsed="0"/>
+    <w:lsdException w:name="Colorful Shading Accent 1" w:semiHidden="0" w:uiPriority="71" w:unhideWhenUsed="0"/>
+    <w:lsdException w:name="Colorful List Accent 1" w:semiHidden="0" w:uiPriority="72" w:unhideWhenUsed="0"/>
+    <w:lsdException w:name="Colorful Grid Accent 1" w:semiHidden="0" w:uiPriority="73" w:unhideWhenUsed="0"/>
+    <w:lsdException w:name="Light Shading Accent 2" w:semiHidden="0" w:uiPriority="60" w:unhideWhenUsed="0"/>
+    <w:lsdException w:name="Light List Accent 2" w:semiHidden="0" w:uiPriority="61" w:unhideWhenUsed="0"/>
+    <w:lsdException w:name="Light Grid Accent 2" w:semiHidden="0" w:uiPriority="62" w:unhideWhenUsed="0"/>
+    <w:lsdException w:name="Medium Shading 1 Accent 2" w:semiHidden="0" w:uiPriority="63" w:unhideWhenUsed="0"/>
+    <w:lsdException w:name="Medium Shading 2 Accent 2" w:semiHidden="0" w:uiPriority="64" w:unhideWhenUsed="0"/>
+    <w:lsdException w:name="Medium List 1 Accent 2" w:semiHidden="0" w:uiPriority="65" w:unhideWhenUsed="0"/>
+    <w:lsdException w:name="Medium List 2 Accent 2" w:semiHidden="0" w:uiPriority="66" w:unhideWhenUsed="0"/>
+    <w:lsdException w:name="Medium Grid 1 Accent 2" w:semiHidden="0" w:uiPriority="67" w:unhideWhenUsed="0"/>
+    <w:lsdException w:name="Medium Grid 2 Accent 2" w:semiHidden="0" w:uiPriority="68" w:unhideWhenUsed="0"/>
+    <w:lsdException w:name="Medium Grid 3 Accent 2" w:semiHidden="0" w:uiPriority="69" w:unhideWhenUsed="0"/>
+    <w:lsdException w:name="Dark List Accent 2" w:semiHidden="0" w:uiPriority="70" w:unhideWhenUsed="0"/>
+    <w:lsdException w:name="Colorful Shading Accent 2" w:semiHidden="0" w:uiPriority="71" w:unhideWhenUsed="0"/>
+    <w:lsdException w:name="Colorful List Accent 2" w:semiHidden="0" w:uiPriority="72" w:unhideWhenUsed="0"/>
+    <w:lsdException w:name="Colorful Grid Accent 2" w:semiHidden="0" w:uiPriority="73" w:unhideWhenUsed="0"/>
+    <w:lsdException w:name="Light Shading Accent 3" w:semiHidden="0" w:uiPriority="60" w:unhideWhenUsed="0"/>
+    <w:lsdException w:name="Light List Accent 3" w:semiHidden="0" w:uiPriority="61" w:unhideWhenUsed="0"/>
+    <w:lsdException w:name="Light Grid Accent 3" w:semiHidden="0" w:uiPriority="62" w:unhideWhenUsed="0"/>
+    <w:lsdException w:name="Medium Shading 1 Accent 3" w:semiHidden="0" w:uiPriority="63" w:unhideWhenUsed="0"/>
+    <w:lsdException w:name="Medium Shading 2 Accent 3" w:semiHidden="0" w:uiPriority="64" w:unhideWhenUsed="0"/>
+    <w:lsdException w:name="Medium List 1 Accent 3" w:semiHidden="0" w:uiPriority="65" w:unhideWhenUsed="0"/>
+    <w:lsdException w:name="Medium List 2 Accent 3" w:semiHidden="0" w:uiPriority="66" w:unhideWhenUsed="0"/>
+    <w:lsdException w:name="Medium Grid 1 Accent 3" w:semiHidden="0" w:uiPriority="67" w:unhideWhenUsed="0"/>
+    <w:lsdException w:name="Medium Grid 2 Accent 3" w:semiHidden="0" w:uiPriority="68" w:unhideWhenUsed="0"/>
+    <w:lsdException w:name="Medium Grid 3 Accent 3" w:semiHidden="0" w:uiPriority="69" w:unhideWhenUsed="0"/>
+    <w:lsdException w:name="Dark List Accent 3" w:semiHidden="0" w:uiPriority="70" w:unhideWhenUsed="0"/>
+    <w:lsdException w:name="Colorful Shading Accent 3" w:semiHidden="0" w:uiPriority="71" w:unhideWhenUsed="0"/>
+    <w:lsdException w:name="Colorful List Accent 3" w:semiHidden="0" w:uiPriority="72" w:unhideWhenUsed="0"/>
+    <w:lsdException w:name="Colorful Grid Accent 3" w:semiHidden="0" w:uiPriority="73" w:unhideWhenUsed="0"/>
+    <w:lsdException w:name="Light Shading Accent 4" w:semiHidden="0" w:uiPriority="60" w:unhideWhenUsed="0"/>
+    <w:lsdException w:name="Light List Accent 4" w:semiHidden="0" w:uiPriority="61" w:unhideWhenUsed="0"/>
+    <w:lsdException w:name="Light Grid Accent 4" w:semiHidden="0" w:uiPriority="62" w:unhideWhenUsed="0"/>
+    <w:lsdException w:name="Medium Shading 1 Accent 4" w:semiHidden="0" w:uiPriority="63" w:unhideWhenUsed="0"/>
+    <w:lsdException w:name="Medium Shading 2 Accent 4" w:semiHidden="0" w:uiPriority="64" w:unhideWhenUsed="0"/>
+    <w:lsdException w:name="Medium List 1 Accent 4" w:semiHidden="0" w:uiPriority="65" w:unhideWhenUsed="0"/>
+    <w:lsdException w:name="Medium List 2 Accent 4" w:semiHidden="0" w:uiPriority="66" w:unhideWhenUsed="0"/>
+    <w:lsdException w:name="Medium Grid 1 Accent 4" w:semiHidden="0" w:uiPriority="67" w:unhideWhenUsed="0"/>
+    <w:lsdException w:name="Medium Grid 2 Accent 4" w:semiHidden="0" w:uiPriority="68" w:unhideWhenUsed="0"/>
+    <w:lsdException w:name="Medium Grid 3 Accent 4" w:semiHidden="0" w:uiPriority="69" w:unhideWhenUsed="0"/>
+    <w:lsdException w:name="Dark List Accent 4" w:semiHidden="0" w:uiPriority="70" w:unhideWhenUsed="0"/>
+    <w:lsdException w:name="Colorful Shading Accent 4" w:semiHidden="0" w:uiPriority="71" w:unhideWhenUsed="0"/>
+    <w:lsdException w:name="Colorful List Accent 4" w:semiHidden="0" w:uiPriority="72" w:unhideWhenUsed="0"/>
+    <w:lsdException w:name="Colorful Grid Accent 4" w:semiHidden="0" w:uiPriority="73" w:unhideWhenUsed="0"/>
+    <w:lsdException w:name="Light Shading Accent 5" w:semiHidden="0" w:uiPriority="60" w:unhideWhenUsed="0"/>
+    <w:lsdException w:name="Light List Accent 5" w:semiHidden="0" w:uiPriority="61" w:unhideWhenUsed="0"/>
+    <w:lsdException w:name="Light Grid Accent 5" w:semiHidden="0" w:uiPriority="62" w:unhideWhenUsed="0"/>
+    <w:lsdException w:name="Medium Shading 1 Accent 5" w:semiHidden="0" w:uiPriority="63" w:unhideWhenUsed="0"/>
+    <w:lsdException w:name="Medium Shading 2 Accent 5" w:semiHidden="0" w:uiPriority="64" w:unhideWhenUsed="0"/>
+    <w:lsdException w:name="Medium List 1 Accent 5" w:semiHidden="0" w:uiPriority="65" w:unhideWhenUsed="0"/>
+    <w:lsdException w:name="Medium List 2 Accent 5" w:semiHidden="0" w:uiPriority="66" w:unhideWhenUsed="0"/>
+    <w:lsdException w:name="Medium Grid 1 Accent 5" w:semiHidden="0" w:uiPriority="67" w:unhideWhenUsed="0"/>
+    <w:lsdException w:name="Medium Grid 2 Accent 5" w:semiHidden="0" w:uiPriority="68" w:unhideWhenUsed="0"/>
+    <w:lsdException w:name="Medium Grid 3 Accent 5" w:semiHidden="0" w:uiPriority="69" w:unhideWhenUsed="0"/>
+    <w:lsdException w:name="Dark List Accent 5" w:semiHidden="0" w:uiPriority="70" w:unhideWhenUsed="0"/>
+    <w:lsdException w:name="Colorful Shading Accent 5" w:semiHidden="0" w:uiPriority="71" w:unhideWhenUsed="0"/>
+    <w:lsdException w:name="Colorful List Accent 5" w:semiHidden="0" w:uiPriority="72" w:unhideWhenUsed="0"/>
+    <w:lsdException w:name="Colorful Grid Accent 5" w:semiHidden="0" w:uiPriority="73" w:unhideWhenUsed="0"/>
+    <w:lsdException w:name="Light Shading Accent 6" w:semiHidden="0" w:uiPriority="60" w:unhideWhenUsed="0"/>
+    <w:lsdException w:name="Light List Accent 6" w:semiHidden="0" w:uiPriority="61" w:unhideWhenUsed="0"/>
+    <w:lsdException w:name="Light Grid Accent 6" w:semiHidden="0" w:uiPriority="62" w:unhideWhenUsed="0"/>
+    <w:lsdException w:name="Medium Shading 1 Accent 6" w:semiHidden="0" w:uiPriority="63" w:unhideWhenUsed="0"/>
+    <w:lsdException w:name="Medium Shading 2 Accent 6" w:semiHidden="0" w:uiPriority="64" w:unhideWhenUsed="0"/>
+    <w:lsdException w:name="Medium List 1 Accent 6" w:semiHidden="0" w:uiPriority="65" w:unhideWhenUsed="0"/>
+    <w:lsdException w:name="Medium List 2 Accent 6" w:semiHidden="0" w:uiPriority="66" w:unhideWhenUsed="0"/>
+    <w:lsdException w:name="Medium Grid 1 Accent 6" w:semiHidden="0" w:uiPriority="67" w:unhideWhenUsed="0"/>
+    <w:lsdException w:name="Medium Grid 2 Accent 6" w:semiHidden="0" w:uiPriority="68" w:unhideWhenUsed="0"/>
+    <w:lsdException w:name="Medium Grid 3 Accent 6" w:semiHidden="0" w:uiPriority="69" w:unhideWhenUsed="0"/>
+    <w:lsdException w:name="Dark List Accent 6" w:semiHidden="0" w:uiPriority="70" w:unhideWhenUsed="0"/>
+    <w:lsdException w:name="Colorful Shading Accent 6" w:semiHidden="0" w:uiPriority="71" w:unhideWhenUsed="0"/>
+    <w:lsdException w:name="Colorful List Accent 6" w:semiHidden="0" w:uiPriority="72" w:unhideWhenUsed="0"/>
+    <w:lsdException w:name="Colorful Grid Accent 6" w:semiHidden="0" w:uiPriority="73" w:unhideWhenUsed="0"/>
+    <w:lsdException w:name="Subtle Emphasis" w:semiHidden="0" w:uiPriority="19" w:unhideWhenUsed="0" w:qFormat="1"/>
+    <w:lsdException w:name="Intense Emphasis" w:semiHidden="0" w:uiPriority="21" w:unhideWhenUsed="0" w:qFormat="1"/>
+    <w:lsdException w:name="Subtle Reference" w:semiHidden="0" w:uiPriority="31" w:unhideWhenUsed="0" w:qFormat="1"/>
+    <w:lsdException w:name="Intense Reference" w:semiHidden="0" w:uiPriority="32" w:unhideWhenUsed="0" w:qFormat="1"/>
+    <w:lsdException w:name="Book Title" w:semiHidden="0" w:uiPriority="33" w:unhideWhenUsed="0" w:qFormat="1"/>
+    <w:lsdException w:name="Bibliography" w:uiPriority="37"/>
+    <w:lsdException w:name="TOC Heading" w:uiPriority="39" w:qFormat="1"/>
   </w:latentStyles>
-  <w:style w:type="paragraph" w:default="1" w:styleId="a">
+  <w:style w:type="paragraph" w:default="1" w:styleId="Normal">
     <w:name w:val="Normal"/>
     <w:qFormat/>
     <w:rsid w:val="00440753"/>
   </w:style>
-  <w:style w:type="paragraph" w:styleId="1">
+  <w:style w:type="paragraph" w:styleId="Heading1">
     <w:name w:val="heading 1"/>
-    <w:next w:val="a"/>
-    <w:link w:val="10"/>
+    <w:next w:val="Normal"/>
+    <w:link w:val="Heading1Char"/>
     <w:rsid w:val="000826E5"/>
     <w:pPr>
       <w:keepNext/>
@@ -1870,13 +1920,13 @@
       <w:lang w:eastAsia="ru-RU"/>
     </w:rPr>
   </w:style>
-  <w:style w:type="character" w:default="1" w:styleId="a0">
+  <w:style w:type="character" w:default="1" w:styleId="DefaultParagraphFont">
     <w:name w:val="Default Paragraph Font"/>
     <w:uiPriority w:val="1"/>
     <w:semiHidden/>
     <w:unhideWhenUsed/>
   </w:style>
-  <w:style w:type="table" w:default="1" w:styleId="a1">
+  <w:style w:type="table" w:default="1" w:styleId="TableNormal">
     <w:name w:val="Normal Table"/>
     <w:uiPriority w:val="99"/>
     <w:semiHidden/>
@@ -1891,16 +1941,16 @@
       </w:tblCellMar>
     </w:tblPr>
   </w:style>
-  <w:style w:type="numbering" w:default="1" w:styleId="a2">
+  <w:style w:type="numbering" w:default="1" w:styleId="NoList">
     <w:name w:val="No List"/>
     <w:uiPriority w:val="99"/>
     <w:semiHidden/>
     <w:unhideWhenUsed/>
   </w:style>
-  <w:style w:type="character" w:customStyle="1" w:styleId="10">
-    <w:name w:val="Заголовок 1 Знак"/>
-    <w:basedOn w:val="a0"/>
-    <w:link w:val="1"/>
+  <w:style w:type="character" w:customStyle="1" w:styleId="Heading1Char">
+    <w:name w:val="Heading 1 Char"/>
+    <w:basedOn w:val="DefaultParagraphFont"/>
+    <w:link w:val="Heading1"/>
     <w:rsid w:val="000826E5"/>
     <w:rPr>
       <w:rFonts w:ascii="Calibri" w:eastAsia="Calibri" w:hAnsi="Calibri" w:cs="Calibri"/>
@@ -1921,9 +1971,9 @@
       </w:numPr>
     </w:pPr>
   </w:style>
-  <w:style w:type="character" w:styleId="a3">
+  <w:style w:type="character" w:styleId="Hyperlink">
     <w:name w:val="Hyperlink"/>
-    <w:basedOn w:val="a0"/>
+    <w:basedOn w:val="DefaultParagraphFont"/>
     <w:uiPriority w:val="99"/>
     <w:unhideWhenUsed/>
     <w:rsid w:val="00C308E2"/>
@@ -1932,13 +1982,13 @@
       <w:u w:val="single"/>
     </w:rPr>
   </w:style>
-  <w:style w:type="character" w:customStyle="1" w:styleId="a4">
+  <w:style w:type="character" w:customStyle="1" w:styleId="a">
     <w:name w:val="Нет"/>
     <w:rsid w:val="00C308E2"/>
   </w:style>
   <w:style w:type="character" w:customStyle="1" w:styleId="Hyperlink0">
     <w:name w:val="Hyperlink.0"/>
-    <w:basedOn w:val="a4"/>
+    <w:basedOn w:val="a"/>
     <w:rsid w:val="00C308E2"/>
     <w:rPr>
       <w:rFonts w:ascii="Palatino Linotype" w:eastAsia="Palatino Linotype" w:hAnsi="Palatino Linotype" w:cs="Palatino Linotype"/>
@@ -1948,15 +1998,16 @@
       <w:lang w:val="en-US"/>
     </w:rPr>
   </w:style>
-  <w:style w:type="table" w:styleId="a5">
+  <w:style w:type="table" w:styleId="TableGrid">
     <w:name w:val="Table Grid"/>
-    <w:basedOn w:val="a1"/>
+    <w:basedOn w:val="TableNormal"/>
     <w:uiPriority w:val="39"/>
     <w:rsid w:val="00D2136F"/>
     <w:pPr>
       <w:spacing w:after="0" w:line="240" w:lineRule="auto"/>
     </w:pPr>
     <w:tblPr>
+      <w:tblInd w:w="0" w:type="dxa"/>
       <w:tblBorders>
         <w:top w:val="single" w:sz="4" w:space="0" w:color="auto"/>
         <w:left w:val="single" w:sz="4" w:space="0" w:color="auto"/>
@@ -1965,12 +2016,18 @@
         <w:insideH w:val="single" w:sz="4" w:space="0" w:color="auto"/>
         <w:insideV w:val="single" w:sz="4" w:space="0" w:color="auto"/>
       </w:tblBorders>
+      <w:tblCellMar>
+        <w:top w:w="0" w:type="dxa"/>
+        <w:left w:w="108" w:type="dxa"/>
+        <w:bottom w:w="0" w:type="dxa"/>
+        <w:right w:w="108" w:type="dxa"/>
+      </w:tblCellMar>
     </w:tblPr>
   </w:style>
-  <w:style w:type="paragraph" w:styleId="a6">
+  <w:style w:type="paragraph" w:styleId="FootnoteText">
     <w:name w:val="footnote text"/>
-    <w:basedOn w:val="a"/>
-    <w:link w:val="a7"/>
+    <w:basedOn w:val="Normal"/>
+    <w:link w:val="FootnoteTextChar"/>
     <w:uiPriority w:val="99"/>
     <w:semiHidden/>
     <w:unhideWhenUsed/>
@@ -1983,10 +2040,10 @@
       <w:szCs w:val="20"/>
     </w:rPr>
   </w:style>
-  <w:style w:type="character" w:customStyle="1" w:styleId="a7">
-    <w:name w:val="Текст сноски Знак"/>
-    <w:basedOn w:val="a0"/>
-    <w:link w:val="a6"/>
+  <w:style w:type="character" w:customStyle="1" w:styleId="FootnoteTextChar">
+    <w:name w:val="Footnote Text Char"/>
+    <w:basedOn w:val="DefaultParagraphFont"/>
+    <w:link w:val="FootnoteText"/>
     <w:uiPriority w:val="99"/>
     <w:semiHidden/>
     <w:rsid w:val="001372FE"/>
@@ -1995,9 +2052,9 @@
       <w:szCs w:val="20"/>
     </w:rPr>
   </w:style>
-  <w:style w:type="character" w:styleId="a8">
+  <w:style w:type="character" w:styleId="FootnoteReference">
     <w:name w:val="footnote reference"/>
-    <w:basedOn w:val="a0"/>
+    <w:basedOn w:val="DefaultParagraphFont"/>
     <w:uiPriority w:val="99"/>
     <w:semiHidden/>
     <w:unhideWhenUsed/>
@@ -2006,9 +2063,9 @@
       <w:vertAlign w:val="superscript"/>
     </w:rPr>
   </w:style>
-  <w:style w:type="table" w:styleId="5">
+  <w:style w:type="table" w:customStyle="1" w:styleId="PlainTable5">
     <w:name w:val="Plain Table 5"/>
-    <w:basedOn w:val="a1"/>
+    <w:basedOn w:val="TableNormal"/>
     <w:uiPriority w:val="45"/>
     <w:rsid w:val="00D21F38"/>
     <w:pPr>
@@ -2017,6 +2074,13 @@
     <w:tblPr>
       <w:tblStyleRowBandSize w:val="1"/>
       <w:tblStyleColBandSize w:val="1"/>
+      <w:tblInd w:w="0" w:type="dxa"/>
+      <w:tblCellMar>
+        <w:top w:w="0" w:type="dxa"/>
+        <w:left w:w="108" w:type="dxa"/>
+        <w:bottom w:w="0" w:type="dxa"/>
+        <w:right w:w="108" w:type="dxa"/>
+      </w:tblCellMar>
     </w:tblPr>
     <w:tblStylePr w:type="firstRow">
       <w:rPr>
@@ -2126,9 +2190,9 @@
       </w:tcPr>
     </w:tblStylePr>
   </w:style>
-  <w:style w:type="table" w:styleId="-1">
+  <w:style w:type="table" w:customStyle="1" w:styleId="GridTable1Light">
     <w:name w:val="Grid Table 1 Light"/>
-    <w:basedOn w:val="a1"/>
+    <w:basedOn w:val="TableNormal"/>
     <w:uiPriority w:val="46"/>
     <w:rsid w:val="00230CDE"/>
     <w:pPr>
@@ -2137,6 +2201,7 @@
     <w:tblPr>
       <w:tblStyleRowBandSize w:val="1"/>
       <w:tblStyleColBandSize w:val="1"/>
+      <w:tblInd w:w="0" w:type="dxa"/>
       <w:tblBorders>
         <w:top w:val="single" w:sz="4" w:space="0" w:color="999999" w:themeColor="text1" w:themeTint="66"/>
         <w:left w:val="single" w:sz="4" w:space="0" w:color="999999" w:themeColor="text1" w:themeTint="66"/>
@@ -2145,6 +2210,12 @@
         <w:insideH w:val="single" w:sz="4" w:space="0" w:color="999999" w:themeColor="text1" w:themeTint="66"/>
         <w:insideV w:val="single" w:sz="4" w:space="0" w:color="999999" w:themeColor="text1" w:themeTint="66"/>
       </w:tblBorders>
+      <w:tblCellMar>
+        <w:top w:w="0" w:type="dxa"/>
+        <w:left w:w="108" w:type="dxa"/>
+        <w:bottom w:w="0" w:type="dxa"/>
+        <w:right w:w="108" w:type="dxa"/>
+      </w:tblCellMar>
     </w:tblPr>
     <w:tblStylePr w:type="firstRow">
       <w:rPr>
@@ -2183,10 +2254,10 @@
       </w:rPr>
     </w:tblStylePr>
   </w:style>
-  <w:style w:type="paragraph" w:styleId="a9">
+  <w:style w:type="paragraph" w:styleId="BalloonText">
     <w:name w:val="Balloon Text"/>
-    <w:basedOn w:val="a"/>
-    <w:link w:val="aa"/>
+    <w:basedOn w:val="Normal"/>
+    <w:link w:val="BalloonTextChar"/>
     <w:uiPriority w:val="99"/>
     <w:semiHidden/>
     <w:unhideWhenUsed/>
@@ -2200,10 +2271,567 @@
       <w:szCs w:val="18"/>
     </w:rPr>
   </w:style>
-  <w:style w:type="character" w:customStyle="1" w:styleId="aa">
-    <w:name w:val="Текст выноски Знак"/>
-    <w:basedOn w:val="a0"/>
-    <w:link w:val="a9"/>
+  <w:style w:type="character" w:customStyle="1" w:styleId="BalloonTextChar">
+    <w:name w:val="Balloon Text Char"/>
+    <w:basedOn w:val="DefaultParagraphFont"/>
+    <w:link w:val="BalloonText"/>
+    <w:uiPriority w:val="99"/>
+    <w:semiHidden/>
+    <w:rsid w:val="001844A9"/>
+    <w:rPr>
+      <w:rFonts w:ascii="Segoe UI" w:hAnsi="Segoe UI" w:cs="Segoe UI"/>
+      <w:sz w:val="18"/>
+      <w:szCs w:val="18"/>
+    </w:rPr>
+  </w:style>
+</w:styles>
+</file>
+
+<file path=word/stylesWithEffects.xml><?xml version="1.0" encoding="utf-8"?>
+<w:styles xmlns:wpc="http://schemas.microsoft.com/office/word/2010/wordprocessingCanvas" xmlns:mc="http://schemas.openxmlformats.org/markup-compatibility/2006" xmlns:o="urn:schemas-microsoft-com:office:office" xmlns:r="http://schemas.openxmlformats.org/officeDocument/2006/relationships" xmlns:m="http://schemas.openxmlformats.org/officeDocument/2006/math" xmlns:v="urn:schemas-microsoft-com:vml" xmlns:wp14="http://schemas.microsoft.com/office/word/2010/wordprocessingDrawing" xmlns:wp="http://schemas.openxmlformats.org/drawingml/2006/wordprocessingDrawing" xmlns:w10="urn:schemas-microsoft-com:office:word" xmlns:w="http://schemas.openxmlformats.org/wordprocessingml/2006/main" xmlns:w14="http://schemas.microsoft.com/office/word/2010/wordml" xmlns:wpg="http://schemas.microsoft.com/office/word/2010/wordprocessingGroup" xmlns:wpi="http://schemas.microsoft.com/office/word/2010/wordprocessingInk" xmlns:wne="http://schemas.microsoft.com/office/word/2006/wordml" xmlns:wps="http://schemas.microsoft.com/office/word/2010/wordprocessingShape" mc:Ignorable="w14 wp14">
+  <w:docDefaults>
+    <w:rPrDefault>
+      <w:rPr>
+        <w:rFonts w:asciiTheme="minorHAnsi" w:eastAsiaTheme="minorEastAsia" w:hAnsiTheme="minorHAnsi" w:cstheme="minorBidi"/>
+        <w:sz w:val="22"/>
+        <w:szCs w:val="22"/>
+        <w:lang w:val="ru-RU" w:eastAsia="zh-CN" w:bidi="ar-SA"/>
+      </w:rPr>
+    </w:rPrDefault>
+    <w:pPrDefault>
+      <w:pPr>
+        <w:spacing w:after="160" w:line="259" w:lineRule="auto"/>
+      </w:pPr>
+    </w:pPrDefault>
+  </w:docDefaults>
+  <w:latentStyles w:defLockedState="0" w:defUIPriority="99" w:defSemiHidden="1" w:defUnhideWhenUsed="1" w:defQFormat="0" w:count="267">
+    <w:lsdException w:name="Normal" w:semiHidden="0" w:uiPriority="0" w:unhideWhenUsed="0" w:qFormat="1"/>
+    <w:lsdException w:name="heading 1" w:semiHidden="0" w:uiPriority="0" w:unhideWhenUsed="0" w:qFormat="1"/>
+    <w:lsdException w:name="heading 2" w:uiPriority="9" w:qFormat="1"/>
+    <w:lsdException w:name="heading 3" w:uiPriority="9" w:qFormat="1"/>
+    <w:lsdException w:name="heading 4" w:uiPriority="9" w:qFormat="1"/>
+    <w:lsdException w:name="heading 5" w:uiPriority="9" w:qFormat="1"/>
+    <w:lsdException w:name="heading 6" w:uiPriority="9" w:qFormat="1"/>
+    <w:lsdException w:name="heading 7" w:uiPriority="9" w:qFormat="1"/>
+    <w:lsdException w:name="heading 8" w:uiPriority="9" w:qFormat="1"/>
+    <w:lsdException w:name="heading 9" w:uiPriority="9" w:qFormat="1"/>
+    <w:lsdException w:name="toc 1" w:uiPriority="39"/>
+    <w:lsdException w:name="toc 2" w:uiPriority="39"/>
+    <w:lsdException w:name="toc 3" w:uiPriority="39"/>
+    <w:lsdException w:name="toc 4" w:uiPriority="39"/>
+    <w:lsdException w:name="toc 5" w:uiPriority="39"/>
+    <w:lsdException w:name="toc 6" w:uiPriority="39"/>
+    <w:lsdException w:name="toc 7" w:uiPriority="39"/>
+    <w:lsdException w:name="toc 8" w:uiPriority="39"/>
+    <w:lsdException w:name="toc 9" w:uiPriority="39"/>
+    <w:lsdException w:name="caption" w:uiPriority="35" w:qFormat="1"/>
+    <w:lsdException w:name="Title" w:semiHidden="0" w:uiPriority="10" w:unhideWhenUsed="0" w:qFormat="1"/>
+    <w:lsdException w:name="Default Paragraph Font" w:uiPriority="1"/>
+    <w:lsdException w:name="Subtitle" w:semiHidden="0" w:uiPriority="11" w:unhideWhenUsed="0" w:qFormat="1"/>
+    <w:lsdException w:name="Strong" w:semiHidden="0" w:uiPriority="22" w:unhideWhenUsed="0" w:qFormat="1"/>
+    <w:lsdException w:name="Emphasis" w:semiHidden="0" w:uiPriority="20" w:unhideWhenUsed="0" w:qFormat="1"/>
+    <w:lsdException w:name="Table Grid" w:semiHidden="0" w:uiPriority="39" w:unhideWhenUsed="0"/>
+    <w:lsdException w:name="Placeholder Text" w:unhideWhenUsed="0"/>
+    <w:lsdException w:name="No Spacing" w:semiHidden="0" w:uiPriority="1" w:unhideWhenUsed="0" w:qFormat="1"/>
+    <w:lsdException w:name="Light Shading" w:semiHidden="0" w:uiPriority="60" w:unhideWhenUsed="0"/>
+    <w:lsdException w:name="Light List" w:semiHidden="0" w:uiPriority="61" w:unhideWhenUsed="0"/>
+    <w:lsdException w:name="Light Grid" w:semiHidden="0" w:uiPriority="62" w:unhideWhenUsed="0"/>
+    <w:lsdException w:name="Medium Shading 1" w:semiHidden="0" w:uiPriority="63" w:unhideWhenUsed="0"/>
+    <w:lsdException w:name="Medium Shading 2" w:semiHidden="0" w:uiPriority="64" w:unhideWhenUsed="0"/>
+    <w:lsdException w:name="Medium List 1" w:semiHidden="0" w:uiPriority="65" w:unhideWhenUsed="0"/>
+    <w:lsdException w:name="Medium List 2" w:semiHidden="0" w:uiPriority="66" w:unhideWhenUsed="0"/>
+    <w:lsdException w:name="Medium Grid 1" w:semiHidden="0" w:uiPriority="67" w:unhideWhenUsed="0"/>
+    <w:lsdException w:name="Medium Grid 2" w:semiHidden="0" w:uiPriority="68" w:unhideWhenUsed="0"/>
+    <w:lsdException w:name="Medium Grid 3" w:semiHidden="0" w:uiPriority="69" w:unhideWhenUsed="0"/>
+    <w:lsdException w:name="Dark List" w:semiHidden="0" w:uiPriority="70" w:unhideWhenUsed="0"/>
+    <w:lsdException w:name="Colorful Shading" w:semiHidden="0" w:uiPriority="71" w:unhideWhenUsed="0"/>
+    <w:lsdException w:name="Colorful List" w:semiHidden="0" w:uiPriority="72" w:unhideWhenUsed="0"/>
+    <w:lsdException w:name="Colorful Grid" w:semiHidden="0" w:uiPriority="73" w:unhideWhenUsed="0"/>
+    <w:lsdException w:name="Light Shading Accent 1" w:semiHidden="0" w:uiPriority="60" w:unhideWhenUsed="0"/>
+    <w:lsdException w:name="Light List Accent 1" w:semiHidden="0" w:uiPriority="61" w:unhideWhenUsed="0"/>
+    <w:lsdException w:name="Light Grid Accent 1" w:semiHidden="0" w:uiPriority="62" w:unhideWhenUsed="0"/>
+    <w:lsdException w:name="Medium Shading 1 Accent 1" w:semiHidden="0" w:uiPriority="63" w:unhideWhenUsed="0"/>
+    <w:lsdException w:name="Medium Shading 2 Accent 1" w:semiHidden="0" w:uiPriority="64" w:unhideWhenUsed="0"/>
+    <w:lsdException w:name="Medium List 1 Accent 1" w:semiHidden="0" w:uiPriority="65" w:unhideWhenUsed="0"/>
+    <w:lsdException w:name="Revision" w:unhideWhenUsed="0"/>
+    <w:lsdException w:name="List Paragraph" w:semiHidden="0" w:uiPriority="34" w:unhideWhenUsed="0" w:qFormat="1"/>
+    <w:lsdException w:name="Quote" w:semiHidden="0" w:uiPriority="29" w:unhideWhenUsed="0" w:qFormat="1"/>
+    <w:lsdException w:name="Intense Quote" w:semiHidden="0" w:uiPriority="30" w:unhideWhenUsed="0" w:qFormat="1"/>
+    <w:lsdException w:name="Medium List 2 Accent 1" w:semiHidden="0" w:uiPriority="66" w:unhideWhenUsed="0"/>
+    <w:lsdException w:name="Medium Grid 1 Accent 1" w:semiHidden="0" w:uiPriority="67" w:unhideWhenUsed="0"/>
+    <w:lsdException w:name="Medium Grid 2 Accent 1" w:semiHidden="0" w:uiPriority="68" w:unhideWhenUsed="0"/>
+    <w:lsdException w:name="Medium Grid 3 Accent 1" w:semiHidden="0" w:uiPriority="69" w:unhideWhenUsed="0"/>
+    <w:lsdException w:name="Dark List Accent 1" w:semiHidden="0" w:uiPriority="70" w:unhideWhenUsed="0"/>
+    <w:lsdException w:name="Colorful Shading Accent 1" w:semiHidden="0" w:uiPriority="71" w:unhideWhenUsed="0"/>
+    <w:lsdException w:name="Colorful List Accent 1" w:semiHidden="0" w:uiPriority="72" w:unhideWhenUsed="0"/>
+    <w:lsdException w:name="Colorful Grid Accent 1" w:semiHidden="0" w:uiPriority="73" w:unhideWhenUsed="0"/>
+    <w:lsdException w:name="Light Shading Accent 2" w:semiHidden="0" w:uiPriority="60" w:unhideWhenUsed="0"/>
+    <w:lsdException w:name="Light List Accent 2" w:semiHidden="0" w:uiPriority="61" w:unhideWhenUsed="0"/>
+    <w:lsdException w:name="Light Grid Accent 2" w:semiHidden="0" w:uiPriority="62" w:unhideWhenUsed="0"/>
+    <w:lsdException w:name="Medium Shading 1 Accent 2" w:semiHidden="0" w:uiPriority="63" w:unhideWhenUsed="0"/>
+    <w:lsdException w:name="Medium Shading 2 Accent 2" w:semiHidden="0" w:uiPriority="64" w:unhideWhenUsed="0"/>
+    <w:lsdException w:name="Medium List 1 Accent 2" w:semiHidden="0" w:uiPriority="65" w:unhideWhenUsed="0"/>
+    <w:lsdException w:name="Medium List 2 Accent 2" w:semiHidden="0" w:uiPriority="66" w:unhideWhenUsed="0"/>
+    <w:lsdException w:name="Medium Grid 1 Accent 2" w:semiHidden="0" w:uiPriority="67" w:unhideWhenUsed="0"/>
+    <w:lsdException w:name="Medium Grid 2 Accent 2" w:semiHidden="0" w:uiPriority="68" w:unhideWhenUsed="0"/>
+    <w:lsdException w:name="Medium Grid 3 Accent 2" w:semiHidden="0" w:uiPriority="69" w:unhideWhenUsed="0"/>
+    <w:lsdException w:name="Dark List Accent 2" w:semiHidden="0" w:uiPriority="70" w:unhideWhenUsed="0"/>
+    <w:lsdException w:name="Colorful Shading Accent 2" w:semiHidden="0" w:uiPriority="71" w:unhideWhenUsed="0"/>
+    <w:lsdException w:name="Colorful List Accent 2" w:semiHidden="0" w:uiPriority="72" w:unhideWhenUsed="0"/>
+    <w:lsdException w:name="Colorful Grid Accent 2" w:semiHidden="0" w:uiPriority="73" w:unhideWhenUsed="0"/>
+    <w:lsdException w:name="Light Shading Accent 3" w:semiHidden="0" w:uiPriority="60" w:unhideWhenUsed="0"/>
+    <w:lsdException w:name="Light List Accent 3" w:semiHidden="0" w:uiPriority="61" w:unhideWhenUsed="0"/>
+    <w:lsdException w:name="Light Grid Accent 3" w:semiHidden="0" w:uiPriority="62" w:unhideWhenUsed="0"/>
+    <w:lsdException w:name="Medium Shading 1 Accent 3" w:semiHidden="0" w:uiPriority="63" w:unhideWhenUsed="0"/>
+    <w:lsdException w:name="Medium Shading 2 Accent 3" w:semiHidden="0" w:uiPriority="64" w:unhideWhenUsed="0"/>
+    <w:lsdException w:name="Medium List 1 Accent 3" w:semiHidden="0" w:uiPriority="65" w:unhideWhenUsed="0"/>
+    <w:lsdException w:name="Medium List 2 Accent 3" w:semiHidden="0" w:uiPriority="66" w:unhideWhenUsed="0"/>
+    <w:lsdException w:name="Medium Grid 1 Accent 3" w:semiHidden="0" w:uiPriority="67" w:unhideWhenUsed="0"/>
+    <w:lsdException w:name="Medium Grid 2 Accent 3" w:semiHidden="0" w:uiPriority="68" w:unhideWhenUsed="0"/>
+    <w:lsdException w:name="Medium Grid 3 Accent 3" w:semiHidden="0" w:uiPriority="69" w:unhideWhenUsed="0"/>
+    <w:lsdException w:name="Dark List Accent 3" w:semiHidden="0" w:uiPriority="70" w:unhideWhenUsed="0"/>
+    <w:lsdException w:name="Colorful Shading Accent 3" w:semiHidden="0" w:uiPriority="71" w:unhideWhenUsed="0"/>
+    <w:lsdException w:name="Colorful List Accent 3" w:semiHidden="0" w:uiPriority="72" w:unhideWhenUsed="0"/>
+    <w:lsdException w:name="Colorful Grid Accent 3" w:semiHidden="0" w:uiPriority="73" w:unhideWhenUsed="0"/>
+    <w:lsdException w:name="Light Shading Accent 4" w:semiHidden="0" w:uiPriority="60" w:unhideWhenUsed="0"/>
+    <w:lsdException w:name="Light List Accent 4" w:semiHidden="0" w:uiPriority="61" w:unhideWhenUsed="0"/>
+    <w:lsdException w:name="Light Grid Accent 4" w:semiHidden="0" w:uiPriority="62" w:unhideWhenUsed="0"/>
+    <w:lsdException w:name="Medium Shading 1 Accent 4" w:semiHidden="0" w:uiPriority="63" w:unhideWhenUsed="0"/>
+    <w:lsdException w:name="Medium Shading 2 Accent 4" w:semiHidden="0" w:uiPriority="64" w:unhideWhenUsed="0"/>
+    <w:lsdException w:name="Medium List 1 Accent 4" w:semiHidden="0" w:uiPriority="65" w:unhideWhenUsed="0"/>
+    <w:lsdException w:name="Medium List 2 Accent 4" w:semiHidden="0" w:uiPriority="66" w:unhideWhenUsed="0"/>
+    <w:lsdException w:name="Medium Grid 1 Accent 4" w:semiHidden="0" w:uiPriority="67" w:unhideWhenUsed="0"/>
+    <w:lsdException w:name="Medium Grid 2 Accent 4" w:semiHidden="0" w:uiPriority="68" w:unhideWhenUsed="0"/>
+    <w:lsdException w:name="Medium Grid 3 Accent 4" w:semiHidden="0" w:uiPriority="69" w:unhideWhenUsed="0"/>
+    <w:lsdException w:name="Dark List Accent 4" w:semiHidden="0" w:uiPriority="70" w:unhideWhenUsed="0"/>
+    <w:lsdException w:name="Colorful Shading Accent 4" w:semiHidden="0" w:uiPriority="71" w:unhideWhenUsed="0"/>
+    <w:lsdException w:name="Colorful List Accent 4" w:semiHidden="0" w:uiPriority="72" w:unhideWhenUsed="0"/>
+    <w:lsdException w:name="Colorful Grid Accent 4" w:semiHidden="0" w:uiPriority="73" w:unhideWhenUsed="0"/>
+    <w:lsdException w:name="Light Shading Accent 5" w:semiHidden="0" w:uiPriority="60" w:unhideWhenUsed="0"/>
+    <w:lsdException w:name="Light List Accent 5" w:semiHidden="0" w:uiPriority="61" w:unhideWhenUsed="0"/>
+    <w:lsdException w:name="Light Grid Accent 5" w:semiHidden="0" w:uiPriority="62" w:unhideWhenUsed="0"/>
+    <w:lsdException w:name="Medium Shading 1 Accent 5" w:semiHidden="0" w:uiPriority="63" w:unhideWhenUsed="0"/>
+    <w:lsdException w:name="Medium Shading 2 Accent 5" w:semiHidden="0" w:uiPriority="64" w:unhideWhenUsed="0"/>
+    <w:lsdException w:name="Medium List 1 Accent 5" w:semiHidden="0" w:uiPriority="65" w:unhideWhenUsed="0"/>
+    <w:lsdException w:name="Medium List 2 Accent 5" w:semiHidden="0" w:uiPriority="66" w:unhideWhenUsed="0"/>
+    <w:lsdException w:name="Medium Grid 1 Accent 5" w:semiHidden="0" w:uiPriority="67" w:unhideWhenUsed="0"/>
+    <w:lsdException w:name="Medium Grid 2 Accent 5" w:semiHidden="0" w:uiPriority="68" w:unhideWhenUsed="0"/>
+    <w:lsdException w:name="Medium Grid 3 Accent 5" w:semiHidden="0" w:uiPriority="69" w:unhideWhenUsed="0"/>
+    <w:lsdException w:name="Dark List Accent 5" w:semiHidden="0" w:uiPriority="70" w:unhideWhenUsed="0"/>
+    <w:lsdException w:name="Colorful Shading Accent 5" w:semiHidden="0" w:uiPriority="71" w:unhideWhenUsed="0"/>
+    <w:lsdException w:name="Colorful List Accent 5" w:semiHidden="0" w:uiPriority="72" w:unhideWhenUsed="0"/>
+    <w:lsdException w:name="Colorful Grid Accent 5" w:semiHidden="0" w:uiPriority="73" w:unhideWhenUsed="0"/>
+    <w:lsdException w:name="Light Shading Accent 6" w:semiHidden="0" w:uiPriority="60" w:unhideWhenUsed="0"/>
+    <w:lsdException w:name="Light List Accent 6" w:semiHidden="0" w:uiPriority="61" w:unhideWhenUsed="0"/>
+    <w:lsdException w:name="Light Grid Accent 6" w:semiHidden="0" w:uiPriority="62" w:unhideWhenUsed="0"/>
+    <w:lsdException w:name="Medium Shading 1 Accent 6" w:semiHidden="0" w:uiPriority="63" w:unhideWhenUsed="0"/>
+    <w:lsdException w:name="Medium Shading 2 Accent 6" w:semiHidden="0" w:uiPriority="64" w:unhideWhenUsed="0"/>
+    <w:lsdException w:name="Medium List 1 Accent 6" w:semiHidden="0" w:uiPriority="65" w:unhideWhenUsed="0"/>
+    <w:lsdException w:name="Medium List 2 Accent 6" w:semiHidden="0" w:uiPriority="66" w:unhideWhenUsed="0"/>
+    <w:lsdException w:name="Medium Grid 1 Accent 6" w:semiHidden="0" w:uiPriority="67" w:unhideWhenUsed="0"/>
+    <w:lsdException w:name="Medium Grid 2 Accent 6" w:semiHidden="0" w:uiPriority="68" w:unhideWhenUsed="0"/>
+    <w:lsdException w:name="Medium Grid 3 Accent 6" w:semiHidden="0" w:uiPriority="69" w:unhideWhenUsed="0"/>
+    <w:lsdException w:name="Dark List Accent 6" w:semiHidden="0" w:uiPriority="70" w:unhideWhenUsed="0"/>
+    <w:lsdException w:name="Colorful Shading Accent 6" w:semiHidden="0" w:uiPriority="71" w:unhideWhenUsed="0"/>
+    <w:lsdException w:name="Colorful List Accent 6" w:semiHidden="0" w:uiPriority="72" w:unhideWhenUsed="0"/>
+    <w:lsdException w:name="Colorful Grid Accent 6" w:semiHidden="0" w:uiPriority="73" w:unhideWhenUsed="0"/>
+    <w:lsdException w:name="Subtle Emphasis" w:semiHidden="0" w:uiPriority="19" w:unhideWhenUsed="0" w:qFormat="1"/>
+    <w:lsdException w:name="Intense Emphasis" w:semiHidden="0" w:uiPriority="21" w:unhideWhenUsed="0" w:qFormat="1"/>
+    <w:lsdException w:name="Subtle Reference" w:semiHidden="0" w:uiPriority="31" w:unhideWhenUsed="0" w:qFormat="1"/>
+    <w:lsdException w:name="Intense Reference" w:semiHidden="0" w:uiPriority="32" w:unhideWhenUsed="0" w:qFormat="1"/>
+    <w:lsdException w:name="Book Title" w:semiHidden="0" w:uiPriority="33" w:unhideWhenUsed="0" w:qFormat="1"/>
+    <w:lsdException w:name="Bibliography" w:uiPriority="37"/>
+    <w:lsdException w:name="TOC Heading" w:uiPriority="39" w:qFormat="1"/>
+  </w:latentStyles>
+  <w:style w:type="paragraph" w:default="1" w:styleId="Normal">
+    <w:name w:val="Normal"/>
+    <w:qFormat/>
+    <w:rsid w:val="00440753"/>
+  </w:style>
+  <w:style w:type="paragraph" w:styleId="Heading1">
+    <w:name w:val="heading 1"/>
+    <w:next w:val="Normal"/>
+    <w:link w:val="Heading1Char"/>
+    <w:rsid w:val="000826E5"/>
+    <w:pPr>
+      <w:keepNext/>
+      <w:keepLines/>
+      <w:pBdr>
+        <w:top w:val="nil"/>
+        <w:left w:val="nil"/>
+        <w:bottom w:val="nil"/>
+        <w:right w:val="nil"/>
+        <w:between w:val="nil"/>
+        <w:bar w:val="nil"/>
+      </w:pBdr>
+      <w:spacing w:before="240" w:after="0"/>
+      <w:outlineLvl w:val="0"/>
+    </w:pPr>
+    <w:rPr>
+      <w:rFonts w:ascii="Calibri" w:eastAsia="Calibri" w:hAnsi="Calibri" w:cs="Calibri"/>
+      <w:color w:val="2E74B5"/>
+      <w:sz w:val="32"/>
+      <w:szCs w:val="32"/>
+      <w:u w:color="2E74B5"/>
+      <w:bdr w:val="nil"/>
+      <w:lang w:eastAsia="ru-RU"/>
+    </w:rPr>
+  </w:style>
+  <w:style w:type="character" w:default="1" w:styleId="DefaultParagraphFont">
+    <w:name w:val="Default Paragraph Font"/>
+    <w:uiPriority w:val="1"/>
+    <w:semiHidden/>
+    <w:unhideWhenUsed/>
+  </w:style>
+  <w:style w:type="table" w:default="1" w:styleId="TableNormal">
+    <w:name w:val="Normal Table"/>
+    <w:uiPriority w:val="99"/>
+    <w:semiHidden/>
+    <w:unhideWhenUsed/>
+    <w:tblPr>
+      <w:tblInd w:w="0" w:type="dxa"/>
+      <w:tblCellMar>
+        <w:top w:w="0" w:type="dxa"/>
+        <w:left w:w="108" w:type="dxa"/>
+        <w:bottom w:w="0" w:type="dxa"/>
+        <w:right w:w="108" w:type="dxa"/>
+      </w:tblCellMar>
+    </w:tblPr>
+  </w:style>
+  <w:style w:type="numbering" w:default="1" w:styleId="NoList">
+    <w:name w:val="No List"/>
+    <w:uiPriority w:val="99"/>
+    <w:semiHidden/>
+    <w:unhideWhenUsed/>
+  </w:style>
+  <w:style w:type="character" w:customStyle="1" w:styleId="Heading1Char">
+    <w:name w:val="Heading 1 Char"/>
+    <w:basedOn w:val="DefaultParagraphFont"/>
+    <w:link w:val="Heading1"/>
+    <w:rsid w:val="000826E5"/>
+    <w:rPr>
+      <w:rFonts w:ascii="Calibri" w:eastAsia="Calibri" w:hAnsi="Calibri" w:cs="Calibri"/>
+      <w:color w:val="2E74B5"/>
+      <w:sz w:val="32"/>
+      <w:szCs w:val="32"/>
+      <w:u w:color="2E74B5"/>
+      <w:bdr w:val="nil"/>
+      <w:lang w:eastAsia="ru-RU"/>
+    </w:rPr>
+  </w:style>
+  <w:style w:type="numbering" w:customStyle="1" w:styleId="4">
+    <w:name w:val="Импортированный стиль 4"/>
+    <w:rsid w:val="000826E5"/>
+    <w:pPr>
+      <w:numPr>
+        <w:numId w:val="1"/>
+      </w:numPr>
+    </w:pPr>
+  </w:style>
+  <w:style w:type="character" w:styleId="Hyperlink">
+    <w:name w:val="Hyperlink"/>
+    <w:basedOn w:val="DefaultParagraphFont"/>
+    <w:uiPriority w:val="99"/>
+    <w:unhideWhenUsed/>
+    <w:rsid w:val="00C308E2"/>
+    <w:rPr>
+      <w:color w:val="0563C1" w:themeColor="hyperlink"/>
+      <w:u w:val="single"/>
+    </w:rPr>
+  </w:style>
+  <w:style w:type="character" w:customStyle="1" w:styleId="a">
+    <w:name w:val="Нет"/>
+    <w:rsid w:val="00C308E2"/>
+  </w:style>
+  <w:style w:type="character" w:customStyle="1" w:styleId="Hyperlink0">
+    <w:name w:val="Hyperlink.0"/>
+    <w:basedOn w:val="a"/>
+    <w:rsid w:val="00C308E2"/>
+    <w:rPr>
+      <w:rFonts w:ascii="Palatino Linotype" w:eastAsia="Palatino Linotype" w:hAnsi="Palatino Linotype" w:cs="Palatino Linotype"/>
+      <w:outline w:val="0"/>
+      <w:color w:val="0563C1"/>
+      <w:u w:val="single" w:color="0563C1"/>
+      <w:lang w:val="en-US"/>
+    </w:rPr>
+  </w:style>
+  <w:style w:type="table" w:styleId="TableGrid">
+    <w:name w:val="Table Grid"/>
+    <w:basedOn w:val="TableNormal"/>
+    <w:uiPriority w:val="39"/>
+    <w:rsid w:val="00D2136F"/>
+    <w:pPr>
+      <w:spacing w:after="0" w:line="240" w:lineRule="auto"/>
+    </w:pPr>
+    <w:tblPr>
+      <w:tblInd w:w="0" w:type="dxa"/>
+      <w:tblBorders>
+        <w:top w:val="single" w:sz="4" w:space="0" w:color="auto"/>
+        <w:left w:val="single" w:sz="4" w:space="0" w:color="auto"/>
+        <w:bottom w:val="single" w:sz="4" w:space="0" w:color="auto"/>
+        <w:right w:val="single" w:sz="4" w:space="0" w:color="auto"/>
+        <w:insideH w:val="single" w:sz="4" w:space="0" w:color="auto"/>
+        <w:insideV w:val="single" w:sz="4" w:space="0" w:color="auto"/>
+      </w:tblBorders>
+      <w:tblCellMar>
+        <w:top w:w="0" w:type="dxa"/>
+        <w:left w:w="108" w:type="dxa"/>
+        <w:bottom w:w="0" w:type="dxa"/>
+        <w:right w:w="108" w:type="dxa"/>
+      </w:tblCellMar>
+    </w:tblPr>
+  </w:style>
+  <w:style w:type="paragraph" w:styleId="FootnoteText">
+    <w:name w:val="footnote text"/>
+    <w:basedOn w:val="Normal"/>
+    <w:link w:val="FootnoteTextChar"/>
+    <w:uiPriority w:val="99"/>
+    <w:semiHidden/>
+    <w:unhideWhenUsed/>
+    <w:rsid w:val="001372FE"/>
+    <w:pPr>
+      <w:spacing w:after="0" w:line="240" w:lineRule="auto"/>
+    </w:pPr>
+    <w:rPr>
+      <w:sz w:val="20"/>
+      <w:szCs w:val="20"/>
+    </w:rPr>
+  </w:style>
+  <w:style w:type="character" w:customStyle="1" w:styleId="FootnoteTextChar">
+    <w:name w:val="Footnote Text Char"/>
+    <w:basedOn w:val="DefaultParagraphFont"/>
+    <w:link w:val="FootnoteText"/>
+    <w:uiPriority w:val="99"/>
+    <w:semiHidden/>
+    <w:rsid w:val="001372FE"/>
+    <w:rPr>
+      <w:sz w:val="20"/>
+      <w:szCs w:val="20"/>
+    </w:rPr>
+  </w:style>
+  <w:style w:type="character" w:styleId="FootnoteReference">
+    <w:name w:val="footnote reference"/>
+    <w:basedOn w:val="DefaultParagraphFont"/>
+    <w:uiPriority w:val="99"/>
+    <w:semiHidden/>
+    <w:unhideWhenUsed/>
+    <w:rsid w:val="001372FE"/>
+    <w:rPr>
+      <w:vertAlign w:val="superscript"/>
+    </w:rPr>
+  </w:style>
+  <w:style w:type="table" w:customStyle="1" w:styleId="PlainTable5">
+    <w:name w:val="Plain Table 5"/>
+    <w:basedOn w:val="TableNormal"/>
+    <w:uiPriority w:val="45"/>
+    <w:rsid w:val="00D21F38"/>
+    <w:pPr>
+      <w:spacing w:after="0" w:line="240" w:lineRule="auto"/>
+    </w:pPr>
+    <w:tblPr>
+      <w:tblStyleRowBandSize w:val="1"/>
+      <w:tblStyleColBandSize w:val="1"/>
+      <w:tblInd w:w="0" w:type="dxa"/>
+      <w:tblCellMar>
+        <w:top w:w="0" w:type="dxa"/>
+        <w:left w:w="108" w:type="dxa"/>
+        <w:bottom w:w="0" w:type="dxa"/>
+        <w:right w:w="108" w:type="dxa"/>
+      </w:tblCellMar>
+    </w:tblPr>
+    <w:tblStylePr w:type="firstRow">
+      <w:rPr>
+        <w:rFonts w:asciiTheme="majorHAnsi" w:eastAsiaTheme="majorEastAsia" w:hAnsiTheme="majorHAnsi" w:cstheme="majorBidi"/>
+        <w:i/>
+        <w:iCs/>
+        <w:sz w:val="26"/>
+      </w:rPr>
+      <w:tblPr/>
+      <w:tcPr>
+        <w:tcBorders>
+          <w:bottom w:val="single" w:sz="4" w:space="0" w:color="7F7F7F" w:themeColor="text1" w:themeTint="80"/>
+        </w:tcBorders>
+        <w:shd w:val="clear" w:color="auto" w:fill="FFFFFF" w:themeFill="background1"/>
+      </w:tcPr>
+    </w:tblStylePr>
+    <w:tblStylePr w:type="lastRow">
+      <w:rPr>
+        <w:rFonts w:asciiTheme="majorHAnsi" w:eastAsiaTheme="majorEastAsia" w:hAnsiTheme="majorHAnsi" w:cstheme="majorBidi"/>
+        <w:i/>
+        <w:iCs/>
+        <w:sz w:val="26"/>
+      </w:rPr>
+      <w:tblPr/>
+      <w:tcPr>
+        <w:tcBorders>
+          <w:top w:val="single" w:sz="4" w:space="0" w:color="7F7F7F" w:themeColor="text1" w:themeTint="80"/>
+        </w:tcBorders>
+        <w:shd w:val="clear" w:color="auto" w:fill="FFFFFF" w:themeFill="background1"/>
+      </w:tcPr>
+    </w:tblStylePr>
+    <w:tblStylePr w:type="firstCol">
+      <w:pPr>
+        <w:jc w:val="right"/>
+      </w:pPr>
+      <w:rPr>
+        <w:rFonts w:asciiTheme="majorHAnsi" w:eastAsiaTheme="majorEastAsia" w:hAnsiTheme="majorHAnsi" w:cstheme="majorBidi"/>
+        <w:i/>
+        <w:iCs/>
+        <w:sz w:val="26"/>
+      </w:rPr>
+      <w:tblPr/>
+      <w:tcPr>
+        <w:tcBorders>
+          <w:right w:val="single" w:sz="4" w:space="0" w:color="7F7F7F" w:themeColor="text1" w:themeTint="80"/>
+        </w:tcBorders>
+        <w:shd w:val="clear" w:color="auto" w:fill="FFFFFF" w:themeFill="background1"/>
+      </w:tcPr>
+    </w:tblStylePr>
+    <w:tblStylePr w:type="lastCol">
+      <w:rPr>
+        <w:rFonts w:asciiTheme="majorHAnsi" w:eastAsiaTheme="majorEastAsia" w:hAnsiTheme="majorHAnsi" w:cstheme="majorBidi"/>
+        <w:i/>
+        <w:iCs/>
+        <w:sz w:val="26"/>
+      </w:rPr>
+      <w:tblPr/>
+      <w:tcPr>
+        <w:tcBorders>
+          <w:left w:val="single" w:sz="4" w:space="0" w:color="7F7F7F" w:themeColor="text1" w:themeTint="80"/>
+        </w:tcBorders>
+        <w:shd w:val="clear" w:color="auto" w:fill="FFFFFF" w:themeFill="background1"/>
+      </w:tcPr>
+    </w:tblStylePr>
+    <w:tblStylePr w:type="band1Vert">
+      <w:tblPr/>
+      <w:tcPr>
+        <w:shd w:val="clear" w:color="auto" w:fill="F2F2F2" w:themeFill="background1" w:themeFillShade="F2"/>
+      </w:tcPr>
+    </w:tblStylePr>
+    <w:tblStylePr w:type="band1Horz">
+      <w:tblPr/>
+      <w:tcPr>
+        <w:shd w:val="clear" w:color="auto" w:fill="F2F2F2" w:themeFill="background1" w:themeFillShade="F2"/>
+      </w:tcPr>
+    </w:tblStylePr>
+    <w:tblStylePr w:type="neCell">
+      <w:tblPr/>
+      <w:tcPr>
+        <w:tcBorders>
+          <w:left w:val="nil"/>
+        </w:tcBorders>
+      </w:tcPr>
+    </w:tblStylePr>
+    <w:tblStylePr w:type="nwCell">
+      <w:tblPr/>
+      <w:tcPr>
+        <w:tcBorders>
+          <w:right w:val="nil"/>
+        </w:tcBorders>
+      </w:tcPr>
+    </w:tblStylePr>
+    <w:tblStylePr w:type="seCell">
+      <w:tblPr/>
+      <w:tcPr>
+        <w:tcBorders>
+          <w:left w:val="nil"/>
+        </w:tcBorders>
+      </w:tcPr>
+    </w:tblStylePr>
+    <w:tblStylePr w:type="swCell">
+      <w:tblPr/>
+      <w:tcPr>
+        <w:tcBorders>
+          <w:right w:val="nil"/>
+        </w:tcBorders>
+      </w:tcPr>
+    </w:tblStylePr>
+  </w:style>
+  <w:style w:type="table" w:customStyle="1" w:styleId="GridTable1Light">
+    <w:name w:val="Grid Table 1 Light"/>
+    <w:basedOn w:val="TableNormal"/>
+    <w:uiPriority w:val="46"/>
+    <w:rsid w:val="00230CDE"/>
+    <w:pPr>
+      <w:spacing w:after="0" w:line="240" w:lineRule="auto"/>
+    </w:pPr>
+    <w:tblPr>
+      <w:tblStyleRowBandSize w:val="1"/>
+      <w:tblStyleColBandSize w:val="1"/>
+      <w:tblInd w:w="0" w:type="dxa"/>
+      <w:tblBorders>
+        <w:top w:val="single" w:sz="4" w:space="0" w:color="999999" w:themeColor="text1" w:themeTint="66"/>
+        <w:left w:val="single" w:sz="4" w:space="0" w:color="999999" w:themeColor="text1" w:themeTint="66"/>
+        <w:bottom w:val="single" w:sz="4" w:space="0" w:color="999999" w:themeColor="text1" w:themeTint="66"/>
+        <w:right w:val="single" w:sz="4" w:space="0" w:color="999999" w:themeColor="text1" w:themeTint="66"/>
+        <w:insideH w:val="single" w:sz="4" w:space="0" w:color="999999" w:themeColor="text1" w:themeTint="66"/>
+        <w:insideV w:val="single" w:sz="4" w:space="0" w:color="999999" w:themeColor="text1" w:themeTint="66"/>
+      </w:tblBorders>
+      <w:tblCellMar>
+        <w:top w:w="0" w:type="dxa"/>
+        <w:left w:w="108" w:type="dxa"/>
+        <w:bottom w:w="0" w:type="dxa"/>
+        <w:right w:w="108" w:type="dxa"/>
+      </w:tblCellMar>
+    </w:tblPr>
+    <w:tblStylePr w:type="firstRow">
+      <w:rPr>
+        <w:b/>
+        <w:bCs/>
+      </w:rPr>
+      <w:tblPr/>
+      <w:tcPr>
+        <w:tcBorders>
+          <w:bottom w:val="single" w:sz="12" w:space="0" w:color="666666" w:themeColor="text1" w:themeTint="99"/>
+        </w:tcBorders>
+      </w:tcPr>
+    </w:tblStylePr>
+    <w:tblStylePr w:type="lastRow">
+      <w:rPr>
+        <w:b/>
+        <w:bCs/>
+      </w:rPr>
+      <w:tblPr/>
+      <w:tcPr>
+        <w:tcBorders>
+          <w:top w:val="double" w:sz="2" w:space="0" w:color="666666" w:themeColor="text1" w:themeTint="99"/>
+        </w:tcBorders>
+      </w:tcPr>
+    </w:tblStylePr>
+    <w:tblStylePr w:type="firstCol">
+      <w:rPr>
+        <w:b/>
+        <w:bCs/>
+      </w:rPr>
+    </w:tblStylePr>
+    <w:tblStylePr w:type="lastCol">
+      <w:rPr>
+        <w:b/>
+        <w:bCs/>
+      </w:rPr>
+    </w:tblStylePr>
+  </w:style>
+  <w:style w:type="paragraph" w:styleId="BalloonText">
+    <w:name w:val="Balloon Text"/>
+    <w:basedOn w:val="Normal"/>
+    <w:link w:val="BalloonTextChar"/>
+    <w:uiPriority w:val="99"/>
+    <w:semiHidden/>
+    <w:unhideWhenUsed/>
+    <w:rsid w:val="001844A9"/>
+    <w:pPr>
+      <w:spacing w:after="0" w:line="240" w:lineRule="auto"/>
+    </w:pPr>
+    <w:rPr>
+      <w:rFonts w:ascii="Segoe UI" w:hAnsi="Segoe UI" w:cs="Segoe UI"/>
+      <w:sz w:val="18"/>
+      <w:szCs w:val="18"/>
+    </w:rPr>
+  </w:style>
+  <w:style w:type="character" w:customStyle="1" w:styleId="BalloonTextChar">
+    <w:name w:val="Balloon Text Char"/>
+    <w:basedOn w:val="DefaultParagraphFont"/>
+    <w:link w:val="BalloonText"/>
     <w:uiPriority w:val="99"/>
     <w:semiHidden/>
     <w:rsid w:val="001844A9"/>
@@ -2259,7 +2887,7 @@
     </a:clrScheme>
     <a:fontScheme name="Стандартная">
       <a:majorFont>
-        <a:latin typeface="Calibri Light" panose="020F0302020204030204"/>
+        <a:latin typeface="Calibri Light"/>
         <a:ea typeface=""/>
         <a:cs typeface=""/>
         <a:font script="Jpan" typeface="游ゴシック Light"/>
@@ -2294,7 +2922,7 @@
         <a:font script="Geor" typeface="Sylfaen"/>
       </a:majorFont>
       <a:minorFont>
-        <a:latin typeface="Calibri" panose="020F0502020204030204"/>
+        <a:latin typeface="Calibri"/>
         <a:ea typeface=""/>
         <a:cs typeface=""/>
         <a:font script="Jpan" typeface="游明朝"/>
@@ -2471,7 +3099,7 @@
   <a:extraClrSchemeLst/>
   <a:extLst>
     <a:ext uri="{05A4C25C-085E-4340-85A3-A5531E510DB2}">
-      <thm15:themeFamily xmlns:thm15="http://schemas.microsoft.com/office/thememl/2012/main" name="Office Theme" id="{62F939B6-93AF-4DB8-9C6B-D6C7DFDC589F}" vid="{4A3C46E8-61CC-4603-A589-7422A47A8E4A}"/>
+      <thm15:themeFamily xmlns:thm15="http://schemas.microsoft.com/office/thememl/2012/main" xmlns="" name="Office Theme" id="{62F939B6-93AF-4DB8-9C6B-D6C7DFDC589F}" vid="{4A3C46E8-61CC-4603-A589-7422A47A8E4A}"/>
     </a:ext>
   </a:extLst>
 </a:theme>

</xml_diff>